<commit_message>
Draft_109_body: remove percentages; counts and whole numbers only
</commit_message>
<xml_diff>
--- a/thesis/003_ThesisProposal_Draft_109_body.docx
+++ b/thesis/003_ThesisProposal_Draft_109_body.docx
@@ -3760,40 +3760,6 @@
             </w:r>
           </w:p>
         </w:tc>
-        <w:tc>
-          <w:tcPr>
-            <w:tcBorders>
-              <w:top w:color="000000" w:space="0" w:sz="18" w:val="single"/>
-              <w:bottom w:color="000000" w:space="0" w:sz="4" w:val="single"/>
-            </w:tcBorders>
-          </w:tcPr>
-          <w:p>
-            <w:pPr>
-              <w:spacing w:after="0" w:before="0" w:line="480" w:lineRule="auto"/>
-              <w:rPr>
-                <w:sz w:val="18"/>
-                <w:szCs w:val="18"/>
-              </w:rPr>
-            </w:pPr>
-            <w:r>
-              <w:rPr>
-                <w:b w:val="1"/>
-                <w:bCs w:val="1"/>
-                <w:i w:val="0"/>
-                <w:iCs w:val="0"/>
-                <w:sz w:val="18"/>
-                <w:szCs w:val="18"/>
-                <w:rtl w:val="0"/>
-              </w:rPr>
-              <w:t xml:space="preserve">Percentage</w:t>
-            </w:r>
-            <w:r>
-              <w:rPr>
-                <w:rtl w:val="0"/>
-              </w:rPr>
-            </w:r>
-          </w:p>
-        </w:tc>
       </w:tr>
       <w:tr>
         <w:trPr>
@@ -3847,26 +3813,6 @@
             </w:r>
           </w:p>
         </w:tc>
-        <w:tc>
-          <w:tcPr/>
-          <w:p>
-            <w:pPr>
-              <w:spacing w:after="0" w:before="0" w:line="480" w:lineRule="auto"/>
-              <w:rPr>
-                <w:sz w:val="18"/>
-                <w:szCs w:val="18"/>
-              </w:rPr>
-            </w:pPr>
-            <w:r>
-              <w:rPr>
-                <w:sz w:val="18"/>
-                <w:szCs w:val="18"/>
-                <w:rtl w:val="0"/>
-              </w:rPr>
-              <w:t xml:space="preserve">30.8%</w:t>
-            </w:r>
-          </w:p>
-        </w:tc>
       </w:tr>
       <w:tr>
         <w:trPr>
@@ -3920,26 +3866,6 @@
             </w:r>
           </w:p>
         </w:tc>
-        <w:tc>
-          <w:tcPr/>
-          <w:p>
-            <w:pPr>
-              <w:spacing w:after="0" w:before="0" w:line="480" w:lineRule="auto"/>
-              <w:rPr>
-                <w:sz w:val="18"/>
-                <w:szCs w:val="18"/>
-              </w:rPr>
-            </w:pPr>
-            <w:r>
-              <w:rPr>
-                <w:sz w:val="18"/>
-                <w:szCs w:val="18"/>
-                <w:rtl w:val="0"/>
-              </w:rPr>
-              <w:t xml:space="preserve">64.6%</w:t>
-            </w:r>
-          </w:p>
-        </w:tc>
       </w:tr>
       <w:tr>
         <w:trPr>
@@ -3993,26 +3919,6 @@
             </w:r>
           </w:p>
         </w:tc>
-        <w:tc>
-          <w:tcPr/>
-          <w:p>
-            <w:pPr>
-              <w:spacing w:after="0" w:before="0" w:line="480" w:lineRule="auto"/>
-              <w:rPr>
-                <w:sz w:val="18"/>
-                <w:szCs w:val="18"/>
-              </w:rPr>
-            </w:pPr>
-            <w:r>
-              <w:rPr>
-                <w:sz w:val="18"/>
-                <w:szCs w:val="18"/>
-                <w:rtl w:val="0"/>
-              </w:rPr>
-              <w:t xml:space="preserve">4.6%</w:t>
-            </w:r>
-          </w:p>
-        </w:tc>
       </w:tr>
       <w:tr>
         <w:trPr>
@@ -4073,33 +3979,6 @@
             </w:r>
           </w:p>
         </w:tc>
-        <w:tc>
-          <w:tcPr/>
-          <w:p>
-            <w:pPr>
-              <w:spacing w:after="0" w:before="0" w:line="480" w:lineRule="auto"/>
-              <w:rPr>
-                <w:sz w:val="18"/>
-                <w:szCs w:val="18"/>
-              </w:rPr>
-            </w:pPr>
-            <w:r>
-              <w:rPr>
-                <w:i w:val="0"/>
-                <w:iCs w:val="0"/>
-                <w:sz w:val="18"/>
-                <w:szCs w:val="18"/>
-                <w:rtl w:val="0"/>
-              </w:rPr>
-              <w:t xml:space="preserve">0.0%</w:t>
-            </w:r>
-            <w:r>
-              <w:rPr>
-                <w:rtl w:val="0"/>
-              </w:rPr>
-            </w:r>
-          </w:p>
-        </w:tc>
       </w:tr>
       <w:tr>
         <w:trPr>
@@ -4161,30 +4040,6 @@
             </w:r>
           </w:p>
         </w:tc>
-        <w:tc>
-          <w:tcPr>
-            <w:tcBorders>
-              <w:bottom w:color="000000" w:space="0" w:sz="18" w:val="single"/>
-            </w:tcBorders>
-          </w:tcPr>
-          <w:p>
-            <w:pPr>
-              <w:spacing w:after="0" w:before="0" w:line="480" w:lineRule="auto"/>
-              <w:rPr>
-                <w:sz w:val="18"/>
-                <w:szCs w:val="18"/>
-              </w:rPr>
-            </w:pPr>
-            <w:r>
-              <w:rPr>
-                <w:sz w:val="18"/>
-                <w:szCs w:val="18"/>
-                <w:rtl w:val="0"/>
-              </w:rPr>
-              <w:t xml:space="preserve">100.0%</w:t>
-            </w:r>
-          </w:p>
-        </w:tc>
       </w:tr>
     </w:tbl>
     <w:p>
@@ -4199,71 +4054,22 @@
           <w:strike w:val="0"/>
           <w:rtl w:val="0"/>
         </w:rPr>
-        <w:t xml:space="preserve">Table 2 presents the overall distribution of hedge types. Lexical hedges dominated the corpus with 42 instances (64.6%), followed by modal verbs with 20 instances (30.8%), and adverbial hedges with 3 instances (4.</w:t>
-      </w:r>
-      <w:r>
-        <w:rPr>
-          <w:rtl w:val="0"/>
-        </w:rPr>
-        <w:t xml:space="preserve">6</w:t>
-      </w:r>
+        <w:t>Table 2 presents the overall distribution of hedge types. Lexical hedges dominated the corpus with 42 instances, followed by modal verbs with 20 instances, and adverbial hedges with 3 instances. No clause-level hedges were identified in any of the 60 abstracts. The literature reports modal verbs as the most frequent hedge type in developing researchers' writing (Khunasathitchai et al., 2025; Wang, 2022). This corpus differs: lexical hedges outnumber modal verbs.</w:t>
+      </w:r>
+    </w:p>
+    <w:p>
+      <w:pPr>
+        <w:spacing w:after="0" w:before="0" w:line="480" w:lineRule="auto"/>
+        <w:ind w:firstLine="720"/>
+        <w:jc w:val="both"/>
+        <w:rPr/>
+      </w:pPr>
       <w:r>
         <w:rPr>
           <w:strike w:val="0"/>
           <w:rtl w:val="0"/>
         </w:rPr>
-        <w:t xml:space="preserve">%). No clause-level hedges were identified in any of the 60 abstracts. The literature reports modal verbs as the most frequent hedge type in developing researchers' writing (Khunasathitchai et al., 2025; Wang, 2022). This corpus differs: lexical hedges outnumber modal verbs.</w:t>
-      </w:r>
-      <w:r>
-        <w:rPr>
-          <w:rtl w:val="0"/>
-        </w:rPr>
-      </w:r>
-    </w:p>
-    <w:p>
-      <w:pPr>
-        <w:spacing w:after="0" w:before="0" w:line="480" w:lineRule="auto"/>
-        <w:ind w:firstLine="720"/>
-        <w:jc w:val="both"/>
-        <w:rPr/>
-      </w:pPr>
-      <w:r>
-        <w:rPr>
-          <w:strike w:val="0"/>
-          <w:rtl w:val="0"/>
-        </w:rPr>
-        <w:t xml:space="preserve">Within the lexical hedge category, the token “potential” accounted for 19 of the 42 lexical instances (45.2%), the single most frequent hedge token in the corpus. Other frequent lexical forms, grouped by root, included “suggest / suggests / suggesting” (13), “imply / implies / implying” (3), and “indicating / indicates” (3). Modal verbs were led by “could” (6), “may” (6), “can” (5), and “might” (3). The 19 potential instances show recurring frames such as “the potential of X as a Y,” “has potential as an X,” and “highlight their potential as X.” Whether those uses express epistemic caution or topic-naming evaluation remains a boundary judgment under the Working Test and is open to alternative readings. Without these 19 tokens, lexical hedges number 2</w:t>
-      </w:r>
-      <w:r>
-        <w:rPr>
-          <w:rtl w:val="0"/>
-        </w:rPr>
-        <w:t xml:space="preserve">3</w:t>
-      </w:r>
-      <w:r>
-        <w:rPr>
-          <w:strike w:val="0"/>
-          <w:rtl w:val="0"/>
-        </w:rPr>
-        <w:t xml:space="preserve"> against 2</w:t>
-      </w:r>
-      <w:r>
-        <w:rPr>
-          <w:rtl w:val="0"/>
-        </w:rPr>
-        <w:t xml:space="preserve">0</w:t>
-      </w:r>
-      <w:r>
-        <w:rPr>
-          <w:strike w:val="0"/>
-          <w:rtl w:val="0"/>
-        </w:rPr>
-        <w:t xml:space="preserve"> modal verbs, so the lexical lead rests on how “potential” is read. Agriculture and Biology account for 15 of the 19 instances. Veterinary Medicine accounts for 4. In scientific English, however, content-oriented lexical hedges often carry more of the epistemic load than modals alone (Hyland, 1998). The dominance of potential fits that pattern in applied-life-science abstracts. Writers reach for a ready English formula that softens application claims (“has potential as…”, “highlight their potential as…”) without building longer clause-level stance. Related work on scientific research writing supports a lexical emphasis. Hyland (1996a) shows that hedging in molecular biology articles is realized mainly by surface lexical forms, with epistemic lexical verbs the largest and most varied group and items such as suggest and indicate among the most frequent. Biologists in that corpus also used fewer modal verbs than writers in general academic English. The present lexical-led profile, driven by potential and suggest in application and implication frames, therefore aligns more with the scientific pattern than with the modal-heavy student pattern.</w:t>
-      </w:r>
-      <w:r>
-        <w:rPr>
-          <w:rtl w:val="0"/>
-        </w:rPr>
+        <w:t>Within the lexical hedge category, the token “potential” accounted for 19 of the 42 lexical instances, the single most frequent hedge token in the corpus. Other frequent lexical forms, grouped by root, included “suggest / suggests / suggesting” (13), “imply / implies / implying” (3), and “indicating / indicates” (3). Modal verbs were led by “could” (6), “may” (6), “can” (5), and “might” (3). The 19 potential instances show recurring frames such as “the potential of X as a Y,” “has potential as an X,” and “highlight their potential as X.” Whether those uses express epistemic caution or topic-naming evaluation remains a boundary judgment under the Working Test and is open to alternative readings. Without these 19 tokens, lexical hedges number 23 against 20 modal verbs, so the lexical lead rests on how “potential” is read. Agriculture and Biology account for 15 of the 19 instances. Veterinary Medicine accounts for 4. In scientific English, however, content-oriented lexical hedges often carry more of the epistemic load than modals alone (Hyland, 1998). The dominance of potential fits that pattern in applied-life-science abstracts. Writers reach for a ready English formula that softens application claims (“has potential as…”, “highlight their potential as…”) without building longer clause-level stance. Related work on scientific research writing supports a lexical emphasis. Hyland (1996a) shows that hedging in molecular biology articles is realized mainly by surface lexical forms, with epistemic lexical verbs the largest and most varied group and items such as suggest and indicate among the most frequent. Biologists in that corpus also used fewer modal verbs than writers in general academic English. The present lexical-led profile, driven by potential and suggest in application and implication frames, therefore aligns more with the scientific pattern than with the modal-heavy student pattern.</w:t>
       </w:r>
     </w:p>
     <w:p>
@@ -4429,39 +4235,6 @@
             </w:r>
           </w:p>
         </w:tc>
-        <w:tc>
-          <w:tcPr>
-            <w:tcBorders>
-              <w:top w:color="000000" w:space="0" w:sz="18" w:val="single"/>
-              <w:bottom w:color="000000" w:space="0" w:sz="6" w:val="single"/>
-            </w:tcBorders>
-          </w:tcPr>
-          <w:p>
-            <w:pPr>
-              <w:spacing w:after="0" w:before="0" w:line="480" w:lineRule="auto"/>
-              <w:jc w:val="center"/>
-              <w:rPr>
-                <w:sz w:val="18"/>
-                <w:szCs w:val="18"/>
-              </w:rPr>
-            </w:pPr>
-            <w:r>
-              <w:rPr>
-                <w:b w:val="1"/>
-                <w:bCs w:val="1"/>
-                <w:sz w:val="18"/>
-                <w:szCs w:val="18"/>
-                <w:rtl w:val="0"/>
-              </w:rPr>
-              <w:t xml:space="preserve">% of total hedges</w:t>
-            </w:r>
-            <w:r>
-              <w:rPr>
-                <w:rtl w:val="0"/>
-              </w:rPr>
-            </w:r>
-          </w:p>
-        </w:tc>
       </w:tr>
       <w:tr>
         <w:trPr>
@@ -4531,27 +4304,6 @@
             </w:r>
           </w:p>
         </w:tc>
-        <w:tc>
-          <w:tcPr/>
-          <w:p>
-            <w:pPr>
-              <w:spacing w:after="0" w:before="0" w:line="480" w:lineRule="auto"/>
-              <w:jc w:val="center"/>
-              <w:rPr>
-                <w:sz w:val="18"/>
-                <w:szCs w:val="18"/>
-              </w:rPr>
-            </w:pPr>
-            <w:r>
-              <w:rPr>
-                <w:sz w:val="18"/>
-                <w:szCs w:val="18"/>
-                <w:rtl w:val="0"/>
-              </w:rPr>
-              <w:t xml:space="preserve">29.2%</w:t>
-            </w:r>
-          </w:p>
-        </w:tc>
       </w:tr>
       <w:tr>
         <w:trPr>
@@ -4621,27 +4373,6 @@
             </w:r>
           </w:p>
         </w:tc>
-        <w:tc>
-          <w:tcPr/>
-          <w:p>
-            <w:pPr>
-              <w:spacing w:after="0" w:before="0" w:line="480" w:lineRule="auto"/>
-              <w:jc w:val="center"/>
-              <w:rPr>
-                <w:sz w:val="18"/>
-                <w:szCs w:val="18"/>
-              </w:rPr>
-            </w:pPr>
-            <w:r>
-              <w:rPr>
-                <w:sz w:val="18"/>
-                <w:szCs w:val="18"/>
-                <w:rtl w:val="0"/>
-              </w:rPr>
-              <w:t xml:space="preserve">10.8%</w:t>
-            </w:r>
-          </w:p>
-        </w:tc>
       </w:tr>
       <w:tr>
         <w:trPr>
@@ -4711,27 +4442,6 @@
             </w:r>
           </w:p>
         </w:tc>
-        <w:tc>
-          <w:tcPr/>
-          <w:p>
-            <w:pPr>
-              <w:spacing w:after="0" w:before="0" w:line="480" w:lineRule="auto"/>
-              <w:jc w:val="center"/>
-              <w:rPr>
-                <w:sz w:val="18"/>
-                <w:szCs w:val="18"/>
-              </w:rPr>
-            </w:pPr>
-            <w:r>
-              <w:rPr>
-                <w:sz w:val="18"/>
-                <w:szCs w:val="18"/>
-                <w:rtl w:val="0"/>
-              </w:rPr>
-              <w:t xml:space="preserve">4.6%</w:t>
-            </w:r>
-          </w:p>
-        </w:tc>
       </w:tr>
       <w:tr>
         <w:trPr>
@@ -4801,27 +4511,6 @@
             </w:r>
           </w:p>
         </w:tc>
-        <w:tc>
-          <w:tcPr/>
-          <w:p>
-            <w:pPr>
-              <w:spacing w:after="0" w:before="0" w:line="480" w:lineRule="auto"/>
-              <w:jc w:val="center"/>
-              <w:rPr>
-                <w:sz w:val="18"/>
-                <w:szCs w:val="18"/>
-              </w:rPr>
-            </w:pPr>
-            <w:r>
-              <w:rPr>
-                <w:sz w:val="18"/>
-                <w:szCs w:val="18"/>
-                <w:rtl w:val="0"/>
-              </w:rPr>
-              <w:t xml:space="preserve">4.6%</w:t>
-            </w:r>
-          </w:p>
-        </w:tc>
       </w:tr>
       <w:tr>
         <w:trPr>
@@ -4891,27 +4580,6 @@
             </w:r>
           </w:p>
         </w:tc>
-        <w:tc>
-          <w:tcPr/>
-          <w:p>
-            <w:pPr>
-              <w:spacing w:after="0" w:before="0" w:line="480" w:lineRule="auto"/>
-              <w:jc w:val="center"/>
-              <w:rPr>
-                <w:sz w:val="18"/>
-                <w:szCs w:val="18"/>
-              </w:rPr>
-            </w:pPr>
-            <w:r>
-              <w:rPr>
-                <w:sz w:val="18"/>
-                <w:szCs w:val="18"/>
-                <w:rtl w:val="0"/>
-              </w:rPr>
-              <w:t xml:space="preserve">3.1%</w:t>
-            </w:r>
-          </w:p>
-        </w:tc>
       </w:tr>
       <w:tr>
         <w:trPr>
@@ -4981,27 +4649,6 @@
             </w:r>
           </w:p>
         </w:tc>
-        <w:tc>
-          <w:tcPr/>
-          <w:p>
-            <w:pPr>
-              <w:spacing w:after="0" w:before="0" w:line="480" w:lineRule="auto"/>
-              <w:jc w:val="center"/>
-              <w:rPr>
-                <w:sz w:val="18"/>
-                <w:szCs w:val="18"/>
-              </w:rPr>
-            </w:pPr>
-            <w:r>
-              <w:rPr>
-                <w:sz w:val="18"/>
-                <w:szCs w:val="18"/>
-                <w:rtl w:val="0"/>
-              </w:rPr>
-              <w:t xml:space="preserve">4.6%</w:t>
-            </w:r>
-          </w:p>
-        </w:tc>
       </w:tr>
       <w:tr>
         <w:trPr>
@@ -5071,27 +4718,6 @@
             </w:r>
           </w:p>
         </w:tc>
-        <w:tc>
-          <w:tcPr/>
-          <w:p>
-            <w:pPr>
-              <w:spacing w:after="0" w:before="0" w:line="480" w:lineRule="auto"/>
-              <w:jc w:val="center"/>
-              <w:rPr>
-                <w:sz w:val="18"/>
-                <w:szCs w:val="18"/>
-              </w:rPr>
-            </w:pPr>
-            <w:r>
-              <w:rPr>
-                <w:sz w:val="18"/>
-                <w:szCs w:val="18"/>
-                <w:rtl w:val="0"/>
-              </w:rPr>
-              <w:t xml:space="preserve">3.1%</w:t>
-            </w:r>
-          </w:p>
-        </w:tc>
       </w:tr>
       <w:tr>
         <w:trPr>
@@ -5161,27 +4787,6 @@
             </w:r>
           </w:p>
         </w:tc>
-        <w:tc>
-          <w:tcPr/>
-          <w:p>
-            <w:pPr>
-              <w:spacing w:after="0" w:before="0" w:line="480" w:lineRule="auto"/>
-              <w:jc w:val="center"/>
-              <w:rPr>
-                <w:sz w:val="18"/>
-                <w:szCs w:val="18"/>
-              </w:rPr>
-            </w:pPr>
-            <w:r>
-              <w:rPr>
-                <w:sz w:val="18"/>
-                <w:szCs w:val="18"/>
-                <w:rtl w:val="0"/>
-              </w:rPr>
-              <w:t xml:space="preserve">1.5%</w:t>
-            </w:r>
-          </w:p>
-        </w:tc>
       </w:tr>
       <w:tr>
         <w:trPr>
@@ -5251,27 +4856,6 @@
             </w:r>
           </w:p>
         </w:tc>
-        <w:tc>
-          <w:tcPr/>
-          <w:p>
-            <w:pPr>
-              <w:spacing w:after="0" w:before="0" w:line="480" w:lineRule="auto"/>
-              <w:jc w:val="center"/>
-              <w:rPr>
-                <w:sz w:val="18"/>
-                <w:szCs w:val="18"/>
-              </w:rPr>
-            </w:pPr>
-            <w:r>
-              <w:rPr>
-                <w:sz w:val="18"/>
-                <w:szCs w:val="18"/>
-                <w:rtl w:val="0"/>
-              </w:rPr>
-              <w:t xml:space="preserve">1.5%</w:t>
-            </w:r>
-          </w:p>
-        </w:tc>
       </w:tr>
       <w:tr>
         <w:trPr>
@@ -5341,27 +4925,6 @@
             </w:r>
           </w:p>
         </w:tc>
-        <w:tc>
-          <w:tcPr/>
-          <w:p>
-            <w:pPr>
-              <w:spacing w:after="0" w:before="0" w:line="480" w:lineRule="auto"/>
-              <w:jc w:val="center"/>
-              <w:rPr>
-                <w:sz w:val="18"/>
-                <w:szCs w:val="18"/>
-              </w:rPr>
-            </w:pPr>
-            <w:r>
-              <w:rPr>
-                <w:sz w:val="18"/>
-                <w:szCs w:val="18"/>
-                <w:rtl w:val="0"/>
-              </w:rPr>
-              <w:t xml:space="preserve">1.5%</w:t>
-            </w:r>
-          </w:p>
-        </w:tc>
       </w:tr>
       <w:tr>
         <w:trPr>
@@ -5431,27 +4994,6 @@
             </w:r>
           </w:p>
         </w:tc>
-        <w:tc>
-          <w:tcPr/>
-          <w:p>
-            <w:pPr>
-              <w:spacing w:after="0" w:before="0" w:line="480" w:lineRule="auto"/>
-              <w:jc w:val="center"/>
-              <w:rPr>
-                <w:sz w:val="18"/>
-                <w:szCs w:val="18"/>
-              </w:rPr>
-            </w:pPr>
-            <w:r>
-              <w:rPr>
-                <w:sz w:val="18"/>
-                <w:szCs w:val="18"/>
-                <w:rtl w:val="0"/>
-              </w:rPr>
-              <w:t xml:space="preserve">7.7%</w:t>
-            </w:r>
-          </w:p>
-        </w:tc>
       </w:tr>
       <w:tr>
         <w:trPr>
@@ -5521,27 +5063,6 @@
             </w:r>
           </w:p>
         </w:tc>
-        <w:tc>
-          <w:tcPr/>
-          <w:p>
-            <w:pPr>
-              <w:spacing w:after="0" w:before="0" w:line="480" w:lineRule="auto"/>
-              <w:jc w:val="center"/>
-              <w:rPr>
-                <w:sz w:val="18"/>
-                <w:szCs w:val="18"/>
-              </w:rPr>
-            </w:pPr>
-            <w:r>
-              <w:rPr>
-                <w:sz w:val="18"/>
-                <w:szCs w:val="18"/>
-                <w:rtl w:val="0"/>
-              </w:rPr>
-              <w:t xml:space="preserve">9.2%</w:t>
-            </w:r>
-          </w:p>
-        </w:tc>
       </w:tr>
       <w:tr>
         <w:trPr>
@@ -5611,27 +5132,6 @@
             </w:r>
           </w:p>
         </w:tc>
-        <w:tc>
-          <w:tcPr/>
-          <w:p>
-            <w:pPr>
-              <w:spacing w:after="0" w:before="0" w:line="480" w:lineRule="auto"/>
-              <w:jc w:val="center"/>
-              <w:rPr>
-                <w:sz w:val="18"/>
-                <w:szCs w:val="18"/>
-              </w:rPr>
-            </w:pPr>
-            <w:r>
-              <w:rPr>
-                <w:sz w:val="18"/>
-                <w:szCs w:val="18"/>
-                <w:rtl w:val="0"/>
-              </w:rPr>
-              <w:t xml:space="preserve">9.2%</w:t>
-            </w:r>
-          </w:p>
-        </w:tc>
       </w:tr>
       <w:tr>
         <w:trPr>
@@ -5701,27 +5201,6 @@
             </w:r>
           </w:p>
         </w:tc>
-        <w:tc>
-          <w:tcPr/>
-          <w:p>
-            <w:pPr>
-              <w:spacing w:after="0" w:before="0" w:line="480" w:lineRule="auto"/>
-              <w:jc w:val="center"/>
-              <w:rPr>
-                <w:sz w:val="18"/>
-                <w:szCs w:val="18"/>
-              </w:rPr>
-            </w:pPr>
-            <w:r>
-              <w:rPr>
-                <w:sz w:val="18"/>
-                <w:szCs w:val="18"/>
-                <w:rtl w:val="0"/>
-              </w:rPr>
-              <w:t xml:space="preserve">4.6%</w:t>
-            </w:r>
-          </w:p>
-        </w:tc>
       </w:tr>
       <w:tr>
         <w:trPr>
@@ -5791,27 +5270,6 @@
             </w:r>
           </w:p>
         </w:tc>
-        <w:tc>
-          <w:tcPr/>
-          <w:p>
-            <w:pPr>
-              <w:spacing w:after="0" w:before="0" w:line="480" w:lineRule="auto"/>
-              <w:jc w:val="center"/>
-              <w:rPr>
-                <w:sz w:val="18"/>
-                <w:szCs w:val="18"/>
-              </w:rPr>
-            </w:pPr>
-            <w:r>
-              <w:rPr>
-                <w:sz w:val="18"/>
-                <w:szCs w:val="18"/>
-                <w:rtl w:val="0"/>
-              </w:rPr>
-              <w:t xml:space="preserve">4.6%</w:t>
-            </w:r>
-          </w:p>
-        </w:tc>
       </w:tr>
       <w:tr>
         <w:trPr>
@@ -5890,32 +5348,6 @@
                 <w:rtl w:val="0"/>
               </w:rPr>
               <w:t xml:space="preserve">65</w:t>
-            </w:r>
-          </w:p>
-        </w:tc>
-        <w:tc>
-          <w:tcPr>
-            <w:tcBorders>
-              <w:top w:color="000000" w:space="0" w:sz="6" w:val="single"/>
-              <w:bottom w:color="000000" w:space="0" w:sz="18" w:val="single"/>
-            </w:tcBorders>
-          </w:tcPr>
-          <w:p>
-            <w:pPr>
-              <w:spacing w:after="0" w:before="0" w:line="480" w:lineRule="auto"/>
-              <w:jc w:val="center"/>
-              <w:rPr>
-                <w:sz w:val="18"/>
-                <w:szCs w:val="18"/>
-              </w:rPr>
-            </w:pPr>
-            <w:r>
-              <w:rPr>
-                <w:sz w:val="18"/>
-                <w:szCs w:val="18"/>
-                <w:rtl w:val="0"/>
-              </w:rPr>
-              <w:t xml:space="preserve">100.0%</w:t>
             </w:r>
           </w:p>
         </w:tc>
@@ -6313,27 +5745,27 @@
                 <w:szCs w:val="18"/>
                 <w:rtl w:val="0"/>
               </w:rPr>
-              <w:t xml:space="preserve">13 (48.1%)</w:t>
-            </w:r>
-          </w:p>
-        </w:tc>
-        <w:tc>
-          <w:tcPr/>
-          <w:p>
-            <w:pPr>
-              <w:spacing w:after="0" w:before="0" w:line="480" w:lineRule="auto"/>
-              <w:rPr>
-                <w:sz w:val="18"/>
-                <w:szCs w:val="18"/>
-              </w:rPr>
-            </w:pPr>
-            <w:r>
-              <w:rPr>
-                <w:sz w:val="18"/>
-                <w:szCs w:val="18"/>
-                <w:rtl w:val="0"/>
-              </w:rPr>
-              <w:t xml:space="preserve">14 (51.9%)</w:t>
+              <w:t>13</w:t>
+            </w:r>
+          </w:p>
+        </w:tc>
+        <w:tc>
+          <w:tcPr/>
+          <w:p>
+            <w:pPr>
+              <w:spacing w:after="0" w:before="0" w:line="480" w:lineRule="auto"/>
+              <w:rPr>
+                <w:sz w:val="18"/>
+                <w:szCs w:val="18"/>
+              </w:rPr>
+            </w:pPr>
+            <w:r>
+              <w:rPr>
+                <w:sz w:val="18"/>
+                <w:szCs w:val="18"/>
+                <w:rtl w:val="0"/>
+              </w:rPr>
+              <w:t>14</w:t>
             </w:r>
           </w:p>
         </w:tc>
@@ -6462,7 +5894,7 @@
                 <w:szCs w:val="18"/>
                 <w:rtl w:val="0"/>
               </w:rPr>
-              <w:t xml:space="preserve">5 (17.9%)</w:t>
+              <w:t>5</w:t>
             </w:r>
             <w:r>
               <w:rPr>
@@ -6489,7 +5921,7 @@
                 <w:szCs w:val="18"/>
                 <w:rtl w:val="0"/>
               </w:rPr>
-              <w:t xml:space="preserve">20 (71.4%)</w:t>
+              <w:t>20</w:t>
             </w:r>
             <w:r>
               <w:rPr>
@@ -6516,7 +5948,7 @@
                 <w:szCs w:val="18"/>
                 <w:rtl w:val="0"/>
               </w:rPr>
-              <w:t xml:space="preserve">3 (10.7%)</w:t>
+              <w:t>3</w:t>
             </w:r>
             <w:r>
               <w:rPr>
@@ -6630,7 +6062,7 @@
                 <w:szCs w:val="18"/>
                 <w:rtl w:val="0"/>
               </w:rPr>
-              <w:t xml:space="preserve">2 (20.0%)</w:t>
+              <w:t>2</w:t>
             </w:r>
             <w:r>
               <w:rPr>
@@ -6657,7 +6089,7 @@
                 <w:szCs w:val="18"/>
                 <w:rtl w:val="0"/>
               </w:rPr>
-              <w:t xml:space="preserve">8 (80.0%)</w:t>
+              <w:t>8</w:t>
             </w:r>
             <w:r>
               <w:rPr>
@@ -6804,7 +6236,7 @@
                 <w:szCs w:val="18"/>
                 <w:rtl w:val="0"/>
               </w:rPr>
-              <w:t xml:space="preserve">20 (30.8%)</w:t>
+              <w:t>20</w:t>
             </w:r>
           </w:p>
         </w:tc>
@@ -6828,7 +6260,7 @@
                 <w:szCs w:val="18"/>
                 <w:rtl w:val="0"/>
               </w:rPr>
-              <w:t xml:space="preserve">42 (64.6%)</w:t>
+              <w:t>42</w:t>
             </w:r>
           </w:p>
         </w:tc>
@@ -6852,7 +6284,7 @@
                 <w:szCs w:val="18"/>
                 <w:rtl w:val="0"/>
               </w:rPr>
-              <w:t xml:space="preserve">3 (4.6%)</w:t>
+              <w:t>3</w:t>
             </w:r>
           </w:p>
         </w:tc>
@@ -6925,64 +6357,7 @@
           <w:strike w:val="0"/>
           <w:rtl w:val="0"/>
         </w:rPr>
-        <w:t xml:space="preserve">Table 4 shows that Agriculture has a balanced type mix (13 modal verbs, </w:t>
-      </w:r>
-      <w:r>
-        <w:rPr>
-          <w:rtl w:val="0"/>
-        </w:rPr>
-        <w:t xml:space="preserve">48.1</w:t>
-      </w:r>
-      <w:r>
-        <w:rPr>
-          <w:strike w:val="0"/>
-          <w:rtl w:val="0"/>
-        </w:rPr>
-        <w:t xml:space="preserve">% vs. 1</w:t>
-      </w:r>
-      <w:r>
-        <w:rPr>
-          <w:rtl w:val="0"/>
-        </w:rPr>
-        <w:t xml:space="preserve">4</w:t>
-      </w:r>
-      <w:r>
-        <w:rPr>
-          <w:strike w:val="0"/>
-          <w:rtl w:val="0"/>
-        </w:rPr>
-        <w:t xml:space="preserve"> lexical hedges, 5</w:t>
-      </w:r>
-      <w:r>
-        <w:rPr>
-          <w:rtl w:val="0"/>
-        </w:rPr>
-        <w:t xml:space="preserve">1.9</w:t>
-      </w:r>
-      <w:r>
-        <w:rPr>
-          <w:strike w:val="0"/>
-          <w:rtl w:val="0"/>
-        </w:rPr>
-        <w:t xml:space="preserve">%), while Biology is heavily lexical (20 of 28 hedges, 71.4%, with only 5 modal verbs). Veterinary Medicine, with only 10 total hedges, is also predominantly lexical (8 of 10, 80.0%). Agriculture is the only discipline in which modal verbs </w:t>
-      </w:r>
-      <w:r>
-        <w:rPr>
-          <w:rtl w:val="0"/>
-        </w:rPr>
-        <w:t xml:space="preserve">come close to</w:t>
-      </w:r>
-      <w:r>
-        <w:rPr>
-          <w:strike w:val="0"/>
-          <w:rtl w:val="0"/>
-        </w:rPr>
-        <w:t xml:space="preserve"> half of the hedge tokens. That contrast is real in the counts, but the Ag-Bio difference in overall density is marginal and outlier-sensitive (Part II), so type-mix differences should not be read as a stable Agriculture-versus-Biology profile. The near-absence of adverbial hedges across all three disciplines (only 3 instances, all in Biology) points instead to a shared, narrow repertoire.</w:t>
-      </w:r>
-      <w:r>
-        <w:rPr>
-          <w:rtl w:val="0"/>
-        </w:rPr>
+        <w:t>Table 4 shows that Agriculture has a balanced type mix (13 modal verbs vs. 14 lexical hedges), while Biology is heavily lexical (20 of 28 hedges, with only 5 modal verbs). Veterinary Medicine, with only 10 total hedges, is also predominantly lexical (8 of 10). Agriculture is the only discipline in which modal verbs come close to half of the hedge tokens. That contrast is real in the counts, but the Ag-Bio difference in overall density is marginal and outlier-sensitive (Part II), so type-mix differences should not be read as a stable Agriculture-versus-Biology profile. The near-absence of adverbial hedges across all three disciplines (only 3 instances, all in Biology) points instead to a shared, narrow repertoire.</w:t>
       </w:r>
     </w:p>
     <w:p>
@@ -8444,7 +7819,7 @@
         <w:rPr>
           <w:rtl w:val="0"/>
         </w:rPr>
-        <w:t>The number of zero-hedge abstracts makes the same contrast clearer. Of the 60 abstracts, 25 (41.7%) contained zero hedge tokens. Veterinary Medicine accounted for 12 of these zero-hedge abstracts (60% of VM abstracts), Biology for 5 (25%), and Agriculture for 8 (40%). The overrepresentation of Veterinary Medicine in the zero-hedge category is the primary driver of its low density.</w:t>
+        <w:t>The number of zero-hedge abstracts makes the same contrast clearer. Of the 60 abstracts, 25 contained zero hedge tokens. Veterinary Medicine accounted for 12 of these zero-hedge abstracts (12 of 20 VM abstracts), Biology for 5 (5 of 20), and Agriculture for 8 (8 of 20). The overrepresentation of Veterinary Medicine in the zero-hedge category is the primary driver of its low density.</w:t>
       </w:r>
     </w:p>
     <w:p>

</xml_diff>

<commit_message>
Draft_109_body: expand EC/P/FP jargon to plain terms; drop FP subclasses
</commit_message>
<xml_diff>
--- a/thesis/003_ThesisProposal_Draft_109_body.docx
+++ b/thesis/003_ThesisProposal_Draft_109_body.docx
@@ -978,7 +978,7 @@
         <w:rPr>
           <w:rtl w:val="0"/>
         </w:rPr>
-        <w:t xml:space="preserve">This study is grounded in a coding scheme adapted from Hyland’s (1998) classification of hedging forms. The scheme is used here as an English Language Studies instrument for describing how stance is worded in L2 academic English, not only as a tally of tokens by program. Following the definition adopted in this study, a hedge is a device that changes the writer’s stance toward a proposition. Two forms of that change are coded. Epistemic Caution (EC) is reduced commitment to the truth of a knowledge claim. Politeness/Deference (P) is a change in the writer’s relationship to readers or prior work with respect to the same claim. Hyland (1998) supplies the grammatical types coded in the corpus (lexical hedges, modal verbs, adverbial hedges, and clause-level hedges) and the starting point for reading retained hedges in those two forms. False positives are a residual record of candidates that fail the claim condition or both removal checks. They are not a function label. The scheme is adapted for this corpus rather than treated as a fixed published taxonomy.</w:t>
+        <w:t>This study is grounded in a coding scheme adapted from Hyland’s (1998) classification of hedging forms. The scheme is used here as an English Language Studies instrument for describing how stance is worded in L2 academic English, not only as a tally of tokens by program. Following the definition adopted in this study, a hedge is a device that changes the writer’s stance toward a proposition. Two forms of that change are coded. Epistemic caution is reduced commitment to the truth of a knowledge claim. Politeness/deference is a change in the writer’s relationship to readers or prior work with respect to the same claim. Hyland (1998) supplies the grammatical types coded in the corpus (lexical hedges, modal verbs, adverbial hedges, and clause-level hedges) and the starting point for reading retained hedges in those two forms. False positives are a residual record of candidates that fail the claim condition or both removal checks. They are not a function label. The scheme is adapted for this corpus rather than treated as a fixed published taxonomy.</w:t>
       </w:r>
     </w:p>
     <w:p>
@@ -992,7 +992,7 @@
         <w:rPr>
           <w:rtl w:val="0"/>
         </w:rPr>
-        <w:t xml:space="preserve">Hyland (1998) is the type instrument and the broad start for EC and P. Crompton (1997) supplies the boundary rule for Epistemic Caution alone: his restatement test operationalizes the Working Test for EC at Step 2. The study does not adopt Crompton’s full taxonomy. Salager-Meyer (1994) is an interpretive lens in Part IV. Her claim-responsibility account helps read density differences across programs. Hyland (2005) is a second interpretive lens. The stance model helps read what fewer hedges mean where results turn into implications. Neither interpretive lens is an operational coding criterion.</w:t>
+        <w:t>Hyland (1998) is the type instrument and the broad start for epistemic caution and politeness/deference. Crompton (1997) supplies the boundary rule for epistemic caution alone: his restatement test operationalizes the Working Test for epistemic caution at Step 2. The study does not adopt Crompton’s full taxonomy. Salager-Meyer (1994) is an interpretive lens in Part IV. Her claim-responsibility account helps read density differences across programs. Hyland (2005) is a second interpretive lens. The stance model helps read what fewer hedges mean where results turn into implications. Neither interpretive lens is an operational coding criterion.</w:t>
       </w:r>
     </w:p>
     <w:p>
@@ -1007,7 +1007,7 @@
           <w:rFonts w:ascii="Cardo" w:cs="Cardo" w:eastAsia="Cardo" w:hAnsi="Cardo"/>
           <w:rtl w:val="0"/>
         </w:rPr>
-        <w:t>Coding followed the decision rules in Appendix A. After a holistic reading of each abstract, Step 1 marked all possible hedge candidates without counting retained hedges. Step 2 applied a claim condition and two removal checks. Because a hedge changes the writer’s stance toward a proposition, the device must attach to a claim: a statement about data, the world, or prior work that evidence could show to be wrong. Aims, directives, and routine procedures are excluded by kind as a consequence of that definition, not as a coding convenience. Working Test: remove the device. If the claim’s epistemic weight (the writer’s commitment to its truth) rises → EC. Reader Test: remove the device. If epistemic weight stays the same but the claim reaches the reader more bluntly or the writer takes sole ownership against prior work → P. Neither check met → FP. Retention and function assignment are the same operation by design. A token qualifies as a hedge by passing at least one test, and which test it passes is its function. EC and P may be assigned together when a token both reduces commitment to the claim’s truth and softens how the claim meets the reader or prior work. In that case the Working Test still holds, and P is recorded as a concurrent interpersonal reading rather than as a second independent pass of the Reader Test. The Reader Test alone is reserved for pure P, where commitment does not rise. Step 3 assigned grammatical type only to retained EC and P tokens. Reason codes (FP-Rec, FP-Cap, FP-Proc, FP-Gen) label residual rejects. Among retained hedges, the research questions on function ask how tokens split across EC and P under this scope, not what functions hedges might serve outside it.</w:t>
+        <w:t>Coding followed the decision rules in Appendix A. After a holistic reading of each abstract, Step 1 marked all possible hedge candidates without counting retained hedges. Step 2 applied a claim condition and two removal checks. Because a hedge changes the writer’s stance toward a proposition, the device must attach to a claim: a statement about data, the world, or prior work that evidence could show to be wrong. Aims, directives, and routine procedures are excluded by kind as a consequence of that definition, not as a coding convenience. Working Test: remove the device. If the claim’s epistemic weight (the writer’s commitment to its truth) rises → epistemic caution. Reader Test: remove the device. If epistemic weight stays the same but the claim reaches the reader more bluntly or the writer takes sole ownership against prior work → politeness/deference. Neither check met → false positive. Retention and function assignment are the same operation by design. A token qualifies as a hedge by passing at least one test, and which test it passes is its function. epistemic caution and P may be assigned together when a token both reduces commitment to the claim’s truth and softens how the claim meets the reader or prior work. In that case the Working Test still holds, and P is recorded as a concurrent interpersonal reading rather than as a second independent pass of the Reader Test. The Reader Test alone is reserved for pure P, where commitment does not rise. Step 3 assigned grammatical type only to retained epistemic caution and P tokens. Reason codes (false positive, false positive, false positive, false positive) label residual rejects. Among retained hedges, the research questions on function ask how tokens split across epistemic caution and P under this scope, not what functions hedges might serve outside it.</w:t>
       </w:r>
     </w:p>
     <w:p>
@@ -1348,7 +1348,7 @@
         <w:rPr>
           <w:rtl w:val="0"/>
         </w:rPr>
-        <w:t xml:space="preserve">The study also lacks a comparable expert-abstract corpus against which to compare the functional findings. Among retained hedges, no tokens were independently labeled Politeness (P = 0). Softened recommendations were logged as FP-Rec (n = 15), so the null applies to claim-attached softening only. P = 0 is a result under a claim-restricted scheme, consistent with abstract genre compression, rather than a general finding about how these writers handle politeness or directives. Expert abstracts in the same three disciplines, coded with the same Step 1-3 scheme, would help separate genre effects from writer-competence effects.</w:t>
+        <w:t>The study also lacks a comparable expert-abstract corpus against which to compare the functional findings. Among retained hedges, no tokens were independently labeled politeness/deference (0 tokens). Softened recommendations were logged as false positives among recommendation frames (n = 15), so the null applies to claim-attached softening only. The zero count for politeness/deference is a result under a claim-restricted scheme, consistent with abstract genre compression, rather than a general finding about how these writers handle politeness or directives. Expert abstracts in the same three disciplines, coded with the same Step 1-3 scheme, would help separate genre effects from writer-competence effects.</w:t>
       </w:r>
     </w:p>
     <w:p>
@@ -1608,12 +1608,7 @@
           <w:bCs w:val="1"/>
           <w:rtl w:val="0"/>
         </w:rPr>
-        <w:t>Epistemic Weight, conceptually, is the strength of the writer’s commitment to the truth of a proposition (how certain or tentative the claim is). Operationally, Step 2 first requires a claim: a statement about data, the world, or prior work that evidence could show to be wrong. Aims, directives, and routine procedures are excluded by kind. The Working Test then asks whether removing the device raises that claim’s epistemic weight (EC). The Reader Test asks whether epistemic weight stays the same but the claim reaches the reader more bluntly or the writer takes sole ownership against prior work (P). When a token both reduces commitment and softens interpersonal force, it is coded EC with a concurrent P reading under the Working Test path, not as two independent test passes. Non-claims and tokens that meet neither check are logged as FP.</w:t>
-      </w:r>
-      <w:r>
-        <w:rPr>
-          <w:rtl w:val="0"/>
-        </w:rPr>
+        <w:t>Epistemic Weight, conceptually, is the strength of the writer’s commitment to the truth of a proposition (how certain or tentative the claim is). Operationally, Step 2 first requires a claim: a statement about data, the world, or prior work that evidence could show to be wrong. Aims, directives, and routine procedures are excluded by kind. The Working Test then asks whether removing the device raises that claim’s epistemic weight (epistemic caution). The Reader Test asks whether epistemic weight stays the same but the claim reaches the reader more bluntly or the writer takes sole ownership against prior work (politeness/deference). When a token both reduces commitment and softens interpersonal force, it is coded epistemic caution with a concurrent politeness/deference reading under the Working Test path, not as two independent test passes. Non-claims and tokens that meet neither check are logged as false positives.</w:t>
       </w:r>
     </w:p>
     <w:p>
@@ -1629,13 +1624,7 @@
           <w:bCs w:val="1"/>
           <w:rtl w:val="0"/>
         </w:rPr>
-        <w:t xml:space="preserve">Hedge Function</w:t>
-      </w:r>
-      <w:r>
-        <w:rPr>
-          <w:rtl w:val="0"/>
-        </w:rPr>
-        <w:t xml:space="preserve">, conceptually, refers to the rhetorical purpose a hedging device serves in its discourse context. Operationally, this study uses two function labels, adapted from Hyland’s (1998) discussion of hedging functions (not a fixed published taxonomy): Epistemic Caution (EC), which expresses reduced commitment to a claim’s truth or accuracy, and Politeness/Deference (P), which shows interpersonal softening toward readers or prior research. False positives are residual rejects recorded with reason codes.</w:t>
+        <w:t>Hedge Function, conceptually, refers to the rhetorical purpose a hedging device serves in its discourse context. Operationally, this study uses two function labels, adapted from Hyland’s (1998) discussion of hedging functions (not a fixed published taxonomy): epistemic caution, which expresses reduced commitment to a claim’s truth or accuracy, and politeness/deference, which shows interpersonal softening toward readers or prior research. False positives are residual rejects recorded when a candidate fails the claim condition or both removal checks.</w:t>
       </w:r>
     </w:p>
     <w:p>
@@ -1823,27 +1812,7 @@
           <w:bCs w:val="1"/>
           <w:rtl w:val="0"/>
         </w:rPr>
-        <w:t xml:space="preserve">Operational Restatement (Threshold Restatement)</w:t>
-      </w:r>
-      <w:r>
-        <w:rPr>
-          <w:rtl w:val="0"/>
-        </w:rPr>
-        <w:t xml:space="preserve">, conceptually, a phrase that only restates a result already fixed by the measure or a field-standard threshold, without a further uncertain inference. Operationally, evidential verbs used this way (especially indicating) are coded FP-Gen rather than as lexical hedges. In the Coding Decision Rules this rule is also called the “</w:t>
-      </w:r>
-      <w:r>
-        <w:rPr>
-          <w:i w:val="1"/>
-          <w:iCs w:val="1"/>
-          <w:rtl w:val="0"/>
-        </w:rPr>
-        <w:t xml:space="preserve">indicating</w:t>
-      </w:r>
-      <w:r>
-        <w:rPr>
-          <w:rtl w:val="0"/>
-        </w:rPr>
-        <w:t xml:space="preserve">” tautology test.</w:t>
+        <w:t>Operational Restatement (Threshold Restatement), conceptually, a phrase that only restates a result already fixed by the measure or a field-standard threshold, without a further uncertain inference. Operationally, evidential verbs used this way (especially indicating) are coded as false positives rather than as lexical hedges. In the Coding Decision Rules this rule is also called the “indicating” tautology test.</w:t>
       </w:r>
     </w:p>
     <w:p>
@@ -1891,13 +1860,7 @@
           <w:bCs w:val="1"/>
           <w:rtl w:val="0"/>
         </w:rPr>
-        <w:t xml:space="preserve">Softening</w:t>
-      </w:r>
-      <w:r>
-        <w:rPr>
-          <w:rtl w:val="0"/>
-        </w:rPr>
-        <w:t xml:space="preserve">, conceptually, is the reduction of force, directness, imposition, or interpersonal impact in a statement. Operationally, Step 2 tracks softening only on claims (statements about data, the world, or prior work that evidence could show to be wrong). Retained hedges are labeled EC and/or P only, by the Working Test and Reader Test after the claim condition. FP is Aims, directives, and routine procedure fail the claim condition by kind and are logged FP. P = 0 in this study refers to reader-oriented softening of claims, not to softened directives.</w:t>
+        <w:t>Softening, conceptually, is the reduction of force, directness, imposition, or interpersonal impact in a statement. Operationally, Step 2 tracks softening only on claims (statements about data, the world, or prior work that evidence could show to be wrong). Retained hedges are labeled epistemic caution and/or politeness/deference only, by the Working Test and Reader Test after the claim condition. Aims, directives, and routine procedures fail the claim condition by kind and are logged as false positives. The finding of no politeness/deference in this study refers to reader-oriented softening of claims, not to softened directives.</w:t>
       </w:r>
     </w:p>
     <w:p>
@@ -2259,12 +2222,7 @@
           <w:strike w:val="0"/>
           <w:rtl w:val="0"/>
         </w:rPr>
-        <w:t xml:space="preserve">Ambiguous forms such as can, potential, indicating, and possibility may function either as epistemic hedges or as non-epistemic lexical items depending on context. The following decision rules show how the claim condition and removal checks apply. First, “can” combined with an active content verb describing a treatment effect (enhance, promote, reduce, help) fails as a claim-mitigator when it only marks capability (FP-Cap), because removing “can” does not raise the claim’s epistemic weight when the host is ability rather than a finding under doubt. Second, the “indicating” tautology test covers not only numeric restatement but also field-standard interpretive thresholds: “non-toxic” from no mortality observed, “limited benefits” from poor performance, and “superior feed efficiency” from lower feed conversion ratio are treated as operational restatements (FP-Gen) rather than inferential hedges. Third, for “potential + noun,” structural position is how the claim condition applies. Aim and methods clauses are non-claims (what the study set out to do), so “potential” there fails the claim condition and is coded FP-Gen, as when an abstract “explores the potential antifungal properties” of a plant or names “potential pharmaceutical applications” as the object of further study. Results and conclusion frames that qualify a finding-claim remain claims, so “potential” can pass the claim condition and, if the Working Test holds, is coded Lexical EC. When removing the token clearly changes the epistemic weight of a proposition, for example when “presence of potential mycobacterial infections” becomes an asserted presence claim without the modifier, the token is coded Lexical EC. The same claim-condition treatment applies to “possibility + noun” in aim and method sentences. Fourth, when a sentence contains multiple hedge-like tokens, each is tested on its own host clause under the claim condition and the two removal checks. A preceding hedge such as “suggest” is coded separately and does not determine the function of “can.”</w:t>
-      </w:r>
-      <w:r>
-        <w:rPr>
-          <w:rtl w:val="0"/>
-        </w:rPr>
+        <w:t>Ambiguous forms such as can, potential, indicating, and possibility may function either as epistemic hedges or as non-epistemic lexical items depending on context. The following decision rules show how the claim condition and removal checks apply. First, “can” combined with an active content verb describing a treatment effect (enhance, promote, reduce, help) fails as a claim-mitigator when it only marks capability (false positive), because removing “can” does not raise the claim’s epistemic weight when the host is ability rather than a finding under doubt. Second, the “indicating” tautology test covers not only numeric restatement but also field-standard interpretive thresholds: “non-toxic” from no mortality observed, “limited benefits” from poor performance, and “superior feed efficiency” from lower feed conversion ratio are treated as operational restatements (false positive) rather than inferential hedges. Third, for “potential + noun,” structural position is how the claim condition applies. Aim and methods clauses are non-claims (what the study set out to do), so “potential” there fails the claim condition and is coded false positive, as when an abstract “explores the potential antifungal properties” of a plant or names “potential pharmaceutical applications” as the object of further study. Results and conclusion frames that qualify a finding-claim remain claims, so “potential” can pass the claim condition and, if the Working Test holds, is coded Lexical epistemic caution. When removing the token clearly changes the epistemic weight of a proposition, for example when “presence of potential mycobacterial infections” becomes an asserted presence claim without the modifier, the token is coded Lexical epistemic caution. The same claim-condition treatment applies to “possibility + noun” in aim and method sentences. Fourth, when a sentence contains multiple hedge-like tokens, each is tested on its own host clause under the claim condition and the two removal checks. A preceding hedge such as “suggest” is coded separately and does not determine the function of “can.”</w:t>
       </w:r>
     </w:p>
     <w:p>
@@ -6386,38 +6344,7 @@
           <w:strike w:val="0"/>
           <w:rtl w:val="0"/>
         </w:rPr>
-        <w:t xml:space="preserve">Alongside the 65 retained EC hedges (and P = 0), the corpus yielded 65 false positive tokens, hedge-like words that failed the claim condition or both removal checks at Step 2. Table 6 (Part III) places these totals side by side. The false positive breakdown shows FP-Gen (general exclusion, including topic-naming and evidential pointers) at 3</w:t>
-      </w:r>
-      <w:r>
-        <w:rPr>
-          <w:rtl w:val="0"/>
-        </w:rPr>
-        <w:t xml:space="preserve">9</w:t>
-      </w:r>
-      <w:r>
-        <w:rPr>
-          <w:strike w:val="0"/>
-          <w:rtl w:val="0"/>
-        </w:rPr>
-        <w:t xml:space="preserve"> instances, FP-Rec (recommendations) at 15, FP-Proc (procedural norms) at 2, and FP-Cap (capability) at </w:t>
-      </w:r>
-      <w:r>
-        <w:rPr>
-          <w:rtl w:val="0"/>
-        </w:rPr>
-        <w:t xml:space="preserve">9</w:t>
-      </w:r>
-      <w:r>
-        <w:rPr>
-          <w:strike w:val="0"/>
-          <w:rtl w:val="0"/>
-        </w:rPr>
-        <w:t xml:space="preserve">. The high number of FP-Gen tokens reflects topic-naming potential and similar non-claim frames rather than a pre-filter applied before Step 2.</w:t>
-      </w:r>
-      <w:r>
-        <w:rPr>
-          <w:rtl w:val="0"/>
-        </w:rPr>
+        <w:t>Alongside the 65 retained epistemic caution hedges (and no politeness/deference tokens), the corpus yielded 65 false positive tokens, hedge-like words that failed the claim condition or both removal checks at Step 2. Table 6 (Part III) places these totals side by side. The false positive total reflects topic-naming potential, recommendations, capability readings, procedural norms, and similar non-claim frames rather than a pre-filter applied before Step 2.</w:t>
       </w:r>
     </w:p>
     <w:p>
@@ -6748,12 +6675,7 @@
                 <w:szCs w:val="18"/>
                 <w:rtl w:val="0"/>
               </w:rPr>
-              <w:t xml:space="preserve">FPs</w:t>
-            </w:r>
-            <w:r>
-              <w:rPr>
-                <w:rtl w:val="0"/>
-              </w:rPr>
+              <w:t>False positives</w:t>
             </w:r>
           </w:p>
         </w:tc>
@@ -7944,12 +7866,7 @@
           <w:strike w:val="0"/>
           <w:rtl w:val="0"/>
         </w:rPr>
-        <w:t xml:space="preserve">Table 6 summarizes Step 2 outcomes for the coding pool. Of the retained hedges, all 65 were coded Epistemic Caution (EC). Politeness/Deference is null (P = 0). False positives totaled 65 (FP-Gen 39, FP-Rec 15, FP-Cap 9, FP-Proc 2). Those 65 failed the claim condition or both removal checks (reason codes: FP-Gen, FP-Rec, FP-Cap, FP-Proc). The direct comparison is therefore EC = 65, P = 0, FP = 65.</w:t>
-      </w:r>
-      <w:r>
-        <w:rPr>
-          <w:rtl w:val="0"/>
-        </w:rPr>
+        <w:t>Table 6 summarizes Step 2 outcomes for the coding pool. Of the retained hedges, all 65 were coded as epistemic caution. Politeness/deference is null (0). False positives totaled 65. Those 65 failed the claim condition or both removal checks. The direct comparison is therefore epistemic caution = 65, politeness/deference = 0, false positives = 65.</w:t>
       </w:r>
     </w:p>
     <w:p>
@@ -7984,7 +7901,7 @@
         <w:rPr>
           <w:rtl w:val="0"/>
         </w:rPr>
-        <w:t xml:space="preserve">Step 2 Outcomes: EC, P, and FP (Candidate Pool)</w:t>
+        <w:t>Step 2 Outcomes: Epistemic Caution, Politeness/Deference, and False Positives (Candidate Pool)</w:t>
       </w:r>
     </w:p>
     <w:tbl>
@@ -8137,7 +8054,7 @@
                 <w:szCs w:val="18"/>
                 <w:rtl w:val="0"/>
               </w:rPr>
-              <w:t xml:space="preserve">Epistemic Caution (EC) , retained</w:t>
+              <w:t>Epistemic caution , retained</w:t>
             </w:r>
           </w:p>
         </w:tc>
@@ -8210,7 +8127,7 @@
                 <w:szCs w:val="18"/>
                 <w:rtl w:val="0"/>
               </w:rPr>
-              <w:t xml:space="preserve">Politeness/Deference (P) , retained</w:t>
+              <w:t>Politeness/deference , retained</w:t>
             </w:r>
           </w:p>
         </w:tc>
@@ -8292,12 +8209,7 @@
                 <w:szCs w:val="18"/>
                 <w:rtl w:val="0"/>
               </w:rPr>
-              <w:t xml:space="preserve">False positive (FP)</w:t>
-            </w:r>
-            <w:r>
-              <w:rPr>
-                <w:rtl w:val="0"/>
-              </w:rPr>
+              <w:t>False positive</w:t>
             </w:r>
           </w:p>
         </w:tc>
@@ -8422,7 +8334,7 @@
                 <w:szCs w:val="18"/>
                 <w:rtl w:val="0"/>
               </w:rPr>
-              <w:t xml:space="preserve">Logged candidates only (65 retained + 65 FP), not a second hedge count</w:t>
+              <w:t>Logged candidates only (65 retained + 65 false positive), not a second hedge count</w:t>
             </w:r>
           </w:p>
         </w:tc>
@@ -8439,7 +8351,7 @@
         <w:rPr>
           <w:rtl w:val="0"/>
         </w:rPr>
-        <w:t xml:space="preserve">No retained hedge was independently labeled Politeness. Under the Step 2 rule (claim condition, then Working Test and Reader Test), only tokens attached to claims that pass at least one removal check enter the retained hedge set. Candidates that fail the claim condition or both checks, including recommendations and other non-claims, are logged as false positives and do not count in the 65. P = 0 is the distribution of retained functions under that scheme: every claim-attached candidate was tested, and none passed as P. Softened recommendations, where interpersonal softening is most likely, were logged FP-Rec (15 tokens) and never reached the Reader Test, so a scheme that counted them could return a different P total. The result answers the function question as a split within the definition adopted here (stance change toward a proposition), not as evidence about politeness in abstracts generally. An all-EC profile fits how scientific English uses hedges on knowledge claims. Hyland (1996, 1998) treats scientific hedging as a resource for precision, caution, and negotiated commitment to propositions. Salager-Meyer (1994) frames the same work as claim-responsibility management. Hedges distribute responsibility for the accuracy or reach of a statement among the writer, the data, and external conditions.</w:t>
+        <w:t>No retained hedge was independently labeled politeness/deference. Under the Step 2 rule (claim condition, then Working Test and Reader Test), only tokens attached to claims that pass at least one removal check enter the retained hedge set. Candidates that fail the claim condition or both checks, including recommendations and other non-claims, are logged as false positives and do not count in the 65. The zero count for politeness/deference is the distribution of retained functions under that scheme: every claim-attached candidate was tested, and none passed as politeness/deference. Softened recommendations, where interpersonal softening is most likely, were logged as false positives (15 tokens) and never reached the Reader Test, so a scheme that counted them could return a different politeness/deference total. The result answers the function question as a split within the definition adopted here (stance change toward a proposition), not as evidence about politeness in abstracts generally. An all–epistemic caution profile fits how scientific English uses hedges on knowledge claims. Hyland (1996, 1998) treats scientific hedging as a resource for precision, caution, and negotiated commitment to propositions. Salager-Meyer (1994) frames the same work as claim-responsibility management. Hedges distribute responsibility for the accuracy or reach of a statement among the writer, the data, and external conditions.</w:t>
       </w:r>
     </w:p>
     <w:p>
@@ -8453,7 +8365,7 @@
         <w:rPr>
           <w:rtl w:val="0"/>
         </w:rPr>
-        <w:t xml:space="preserve">Gillaerts and Van de Velde (2010) show that research-article abstracts are not miniature full articles. Interactional markers in abstracts have their own make-up, and the degree of interpersonality can be more limited than in the longer text. In this PSAU sample, most retained hedges sit in implication and conclusion sentences rather than in bare results lines. Forms such as potential and suggest/suggests/suggesting qualified applications or interpretations. Results sentences in the same abstracts often use factive verbs (showed, revealed, demonstrated) without qualification. No move-structured count was run, so this is a qualitative reading, but it points to abstracts that report findings directly and hedge mainly where findings turn into meaning. Novice and L2 academic writing further situates the result. Student writers often work with a narrower stance repertoire and lean on classroom habits more than on genre-sensitive interpersonal design (Saengsuwan &amp; Suwannatrai, 2026). In agricultural-science writing, L2 students have been found to use fewer hedges than expert writers in the same field (Qiu et al., 2024). The present corpus shows a related English-language pattern. When hedges were retained, they did epistemic work with a small lexical set. Modal verbs (20 instances, all EC) almost exclusively marked possibility about results or implications, while Lexical hedges (42 instances, all EC) qualified the strength of findings or implications.</w:t>
+        <w:t>Gillaerts and Van de Velde (2010) show that research-article abstracts are not miniature full articles. Interactional markers in abstracts have their own make-up, and the degree of interpersonality can be more limited than in the longer text. In this PSAU sample, most retained hedges sit in implication and conclusion sentences rather than in bare results lines. Forms such as potential and suggest/suggests/suggesting qualified applications or interpretations. Results sentences in the same abstracts often use factive verbs (showed, revealed, demonstrated) without qualification. No move-structured count was run, so this is a qualitative reading, but it points to abstracts that report findings directly and hedge mainly where findings turn into meaning. Novice and L2 academic writing further situates the result. Student writers often work with a narrower stance repertoire and lean on classroom habits more than on genre-sensitive interpersonal design (Saengsuwan &amp; Suwannatrai, 2026). In agricultural-science writing, L2 students have been found to use fewer hedges than expert writers in the same field (Qiu et al., 2024). The present corpus shows a related English-language pattern. When hedges were retained, they did epistemic work with a small lexical set. Modal verbs (20 instances, all epistemic caution) almost exclusively marked possibility about results or implications, while Lexical hedges (42 instances, all epistemic caution) qualified the strength of findings or implications.</w:t>
       </w:r>
     </w:p>
     <w:p>
@@ -9461,7 +9373,7 @@
         <w:rPr>
           <w:rtl w:val="0"/>
         </w:rPr>
-        <w:t xml:space="preserve">Interpretive proposals. Two readings follow from these patterns, offered as hypotheses for later work. First, VM abstracts may more often end on results with no implication sentence, which leaves less to hedge. A move-structured count of the VM subset would show whether this is so. Second, advisers may filter interpersonal softening out of final abstracts, which would help explain the all-EC profile. Comparing early drafts with the ratified abstracts would test it.</w:t>
+        <w:t>Interpretive proposals. Two readings follow from these patterns, offered as hypotheses for later work. First, VM abstracts may more often end on results with no implication sentence, which leaves less to hedge. A move-structured count of the VM subset would show whether this is so. Second, advisers may filter interpersonal softening out of final abstracts, which would help explain the all–epistemic caution profile. Comparing early drafts with the ratified abstracts would test it.</w:t>
       </w:r>
     </w:p>
     <w:p>

</xml_diff>

<commit_message>
Draft_109_body: expand Background of the Study with fuller study analysis and added lit
</commit_message>
<xml_diff>
--- a/thesis/003_ThesisProposal_Draft_109_body.docx
+++ b/thesis/003_ThesisProposal_Draft_109_body.docx
@@ -497,7 +497,7 @@
         <w:rPr>
           <w:rtl w:val="0"/>
         </w:rPr>
-        <w:t xml:space="preserve">Expert writers hedge to present claims with caution rather than absolute certainty. Hyland’s work on scientific and molecular biology research writing shows that hedging is a core rhetorical resource: devices such as may, suggest, or generally signal epistemic stance, mark community membership, and let writers state claims with precision, caution, and deference to colleagues (Hyland, 1996, 1998). Those expert norms are well documented. Far less is known about undergraduate thesis writers, who face the same genre expectations without the same disciplinary training. Do their abstracts reflect field-specific conventions, or only a generic style of caution?</w:t>
+        <w:t>Expert writers hedge to present claims with caution rather than absolute certainty. Hyland’s (1996) study of molecular biology research articles shows that hedging is not decorative caution. It is a core rhetorical resource that lets writers signal epistemic stance, mark membership in a scientific community, and state claims with precision while still showing deference to colleagues. Devices such as may, suggest, and generally recur in that expert prose because they manage how far a claim should be trusted. Hyland (1998) develops that account into a fuller model of hedges as means of reducing commitment to the truth of a proposition or of preferring not to state commitment categorically. Those expert norms in scientific English are well documented. Far less is known about undergraduate thesis writers, who face related genre expectations without the same length of disciplinary training. The open question is whether their abstracts already reflect field-specific conventions, or only a generic style of caution learned as a general writing rule.</w:t>
       </w:r>
     </w:p>
     <w:p>
@@ -565,21 +565,7 @@
         <w:rPr>
           <w:rtl w:val="0"/>
         </w:rPr>
-        <w:t xml:space="preserve">Developing researchers tend to underuse hedges and rely on a narrow set of devices, most often modal verbs (Khunasathitchai et al., 2025; Suratno &amp; Aydawati, 2025; Ghia et al., 2022; Mazidah et al., 2022). Across undergraduate and upper-level student writing, the same core pattern recurs: low hedge density, limited formal variety, and a default to modals such as may or local equivalents such as </w:t>
-      </w:r>
-      <w:r>
-        <w:rPr>
-          <w:i w:val="1"/>
-          <w:iCs w:val="1"/>
-          <w:rtl w:val="0"/>
-        </w:rPr>
-        <w:t xml:space="preserve">dapat</w:t>
-      </w:r>
-      <w:r>
-        <w:rPr>
-          <w:rtl w:val="0"/>
-        </w:rPr>
-        <w:t xml:space="preserve">, linked more to limited rhetorical exposure than to weak grammar. Thesis-abstract studies in Thai, Italian, and Indonesian L2 settings show averages near or below two hedges per abstract and, in some programs, heavier use of boosters than of hedges. Where disciplinary comparison is available among developing writers, as in Wang’s (2022) sixteen-field MICUSP analysis, variation appears, yet modal dominance persists even in fields that hedge more overall.</w:t>
+        <w:t>Studies of developing researchers converge on a restricted hedging repertoire. Khunasathitchai et al. (2025) examined hedging in Thai undergraduate writing and found low overall density with heavy reliance on a small set of modal forms. Suratno and Aydawati (2025) report a similar pattern in non-science thesis writing, where modal verbs carry most of the epistemic work and lexical variety stays narrow. Ghia et al. (2022) analyzed 217 English thesis abstracts written by advanced Italian EFL undergraduates and compared them with successful L1 student writing in the Michigan Corpus of Upper-Level Student Papers. The EFL abstracts used fewer hedges and favored boosters and modals of epistemic certainty more than the L1 comparison group, yet the broad ranking of devices still showed some awareness of academic caution. Mazidah et al. (2022) looked at Southeast Asian undergraduate abstracts and likewise found limited hedge inventories, with discipline-internal differences smaller than the shared tendency to under-hedge relative to expert norms. Across these settings the core pattern recurs: low hedge density, limited formal variety, and a default to modals such as may or to local equivalents, linked more to limited rhetorical exposure than to weak grammar alone.</w:t>
       </w:r>
     </w:p>
     <w:p>
@@ -593,7 +579,7 @@
         <w:rPr>
           <w:rtl w:val="0"/>
         </w:rPr>
-        <w:t xml:space="preserve">These studies leave clear gaps for the present work. Only a few examined abstracts specifically, and most of those focused on English or language majors rather than applied science programs. Others analyzed discussion sections or full papers, where rhetorical space is wider. None is set in a Philippine L2 context for Agriculture, Veterinary Medicine, and Biology undergraduate thesis abstracts.</w:t>
+        <w:t>Wang (2022) extends the student-writing picture across sixteen fields in MICUSP. Hedging was more common in argumentation-driven disciplines than in data-driven ones, and differences also appeared between disciplines housed under the same broad division. That finding challenges a simple natural-versus-social science split. Even so, modal forms remained prominent even in fields that hedged more overall. Halabisaz et al. (2014) compared hedging in applied-linguistics master’s thesis abstracts written by native English and Iranian non-native writers. Native writers used more hedges overall. The authors link the gap to rhetorical sensitivity, audience awareness, and cultural background rather than to grammar alone. Taken together, these studies show that undergraduate and master’s-level writers often under-deploy hedges, lean on modals, and vary by discipline only within a still-narrow range of forms. Clear gaps remain for the present work. Only a few of these studies examined abstracts specifically, and most of those focused on English or language majors rather than applied science programs. Others analyzed discussion sections or full papers, where rhetorical space is wider. None is set in a Philippine L2 context for Agriculture, Veterinary Medicine, and Biology undergraduate thesis abstracts.</w:t>
       </w:r>
     </w:p>
     <w:p>
@@ -633,7 +619,7 @@
         <w:rPr>
           <w:rtl w:val="0"/>
         </w:rPr>
-        <w:t xml:space="preserve">Field norms shape expert hedging, but not along a simple hard/soft divide. Comparative work places humanities writers at the high end of hedge frequency and agriculture near the low end in one multi-field design (Afshar et al., 2014), while other pairings find scientists hedging more than applied linguists (Mohammed, 2011). Within life sciences, biology research articles often favor non-factive reporting verbs as the main hedge type (Souici &amp; Slougui, 2022), and clinical writing may edge slightly above basic science within medicine without a strong statistical separation (Hamidi et al., 2025).</w:t>
+        <w:t>Field norms shape expert hedging, but not along a simple hard-or-soft divide. Afshar et al. (2014) compared research articles across humanities, basic sciences, and agriculture using Salager-Meyer’s (1994) taxonomy. Humanities writers sat at the high end of hedge frequency, while agriculture sat near the low end, and subfields within each broad area also differed. Mohammed (2011), using a different pairing and a lexical-hedge focus, found scientists hedging more than applied linguists. The two results are not necessarily contradictory. They compare different disciplinary pairings and use different hedge inventories, so the shared lesson is that density tracks specific epistemic demands rather than a single hard-or-soft ranking. Within life sciences, Souici and Slougui (2022) examined biology research articles by Algerian authors and found non-factive reporting verbs to be the most prominent hedge type. Writers leaned on forms that support and frame findings rather than on a wide modal set alone. Hamidi et al. (2025) report that clinical writing may edge slightly above basic science within medicine, yet without a strong separation. Expert scientific English therefore shows measurable variation, but the variation is local to how each field handles evidence and claim risk.</w:t>
       </w:r>
     </w:p>
     <w:p>
@@ -647,7 +633,7 @@
         <w:rPr>
           <w:rtl w:val="0"/>
         </w:rPr>
-        <w:t xml:space="preserve">These findings are not necessarily contradictory. Afshar et al. and Mohammed compare different disciplinary pairings and use different hedge taxonomies (Afshar used the full Salager-Meyer (1994) scheme, Mohammed a lexical-hedge focus), so the contrast is evidence that hedging density tracks specific epistemic demands rather than a single hard/soft divide. Salager-Meyer (1994) frames hedging as claim-responsibility management: writers distribute responsibility for a claim’s truth, accuracy, or applicability among themselves, their data, and external conditions. That framing predicts that Agriculture, Veterinary Medicine, and Biology may produce distinct patterns not because one field is “harder,” but because each requires writers to manage different kinds of responsibility.</w:t>
+        <w:t>Salager-Meyer (1994) frames hedging as claim-responsibility management. Writers distribute responsibility for a claim’s truth, accuracy, or applicability among themselves, their data, and external conditions. That lens helps explain why laboratory and clinical fields may not share one density profile with field-based agricultural work even when all three count as applied life science. Hu and Cao (2011) add a further layer by comparing English- and Chinese-medium journal abstracts. English-medium abstracts carried higher hedge rates, and coding required attention to context rather than to word lists alone. Their work also shows that empirical abstracts can carry more boosters than theoretical ones while hedge rates stay similar, which links stance choices to evidence type. For developing writers in L2 settings, the expert picture is a target rather than a description of current practice. The present study asks whether PSAU undergraduates in three applied programs already show any of that field-sensitive differentiation in the compressed genre of the thesis abstract.</w:t>
       </w:r>
     </w:p>
     <w:p>
@@ -687,7 +673,7 @@
         <w:rPr>
           <w:rtl w:val="0"/>
         </w:rPr>
-        <w:t xml:space="preserve">English is the medium of academic writing at PSAU, but not the home language for most students. L2 writers typically use fewer hedges and less formal variety than L1 peers (Demir, 2018; Mohammed, 2011), and publication context can amplify that gap: English-medium journal abstracts show markedly more hedges than Chinese-medium counterparts in the same field (Hu &amp; Cao, 2011). Explicit teaching can raise both frequency and variety among health-science undergraduates, though a preference for modals often remains even after training (Petchkij, 2019).</w:t>
+        <w:t>English is the medium of academic writing at PSAU, but not the home language for most students. Demir (2018) and related L2 work show that second-language writers typically use fewer hedges and less formal variety than L1 peers. Publication context can amplify that gap. Hu and Cao (2011) found English-medium journal abstracts markedly more hedged than Chinese-medium counterparts in the same field, which suggests that the language of publication and the editorial community shape stance as much as individual proficiency. Petchkij (2019) reports that explicit teaching can raise both frequency and variety among health-science undergraduates, though a preference for modals often remains even after training. The instructional finding matters for PSAU: limited hedge variety in student texts is not only a deficit to be counted. It is also a trainable feature of English for academic purposes.</w:t>
       </w:r>
     </w:p>
     <w:p>
@@ -701,7 +687,7 @@
         <w:rPr>
           <w:rtl w:val="0"/>
         </w:rPr>
-        <w:t xml:space="preserve">Since this study does not measure English proficiency independently, observed patterns may reflect L2 constraints, disciplinary socialization, or both. The aim is a descriptive baseline.</w:t>
+        <w:t>Since this study does not measure English proficiency independently, observed patterns may reflect L2 constraints, disciplinary socialization, or both. The aim is a descriptive baseline of how stance is worded in ratified abstracts, not a test of which factor causes the pattern.</w:t>
       </w:r>
     </w:p>
     <w:p>
@@ -741,21 +727,7 @@
         <w:rPr>
           <w:rtl w:val="0"/>
         </w:rPr>
-        <w:t xml:space="preserve">Philippine and regional findings align with this picture. ASEAN learner data, including Philippine samples, show a preference for boosters over hedges and overuse of intensifiers such as </w:t>
-      </w:r>
-      <w:r>
-        <w:rPr>
-          <w:i w:val="1"/>
-          <w:iCs w:val="1"/>
-          <w:rtl w:val="0"/>
-        </w:rPr>
-        <w:t xml:space="preserve">completely, really, and always</w:t>
-      </w:r>
-      <w:r>
-        <w:rPr>
-          <w:rtl w:val="0"/>
-        </w:rPr>
-        <w:t xml:space="preserve"> (Ningrum et al., 2024). Local college essay studies report developing-stage proficiency with epistemic modals dominant and only modest, often non-significant differences by major field (Escalona, 2025; Lopez et al., 2025). Outside the student essay genre, Villanueva (2014) shows hedging used to manage accountability in Philippine newspaper editorials. Different genre, same point: hedging is context-sensitive rather than a fixed national style.</w:t>
+        <w:t>Philippine and regional findings align with this picture. Ningrum et al. (2024) report that ASEAN learner data, including Philippine samples, show a preference for boosters over hedges and overuse of intensifiers such as completely, really, and always. Escalona (2025) and Lopez et al. (2025), in local college essay studies, find developing-stage proficiency with epistemic modals dominant and only modest differences by major field. Those studies examine essays rather than thesis abstracts, so they cannot be read as direct predictions for the present corpus. They do show that Philippine L2 academic English often leans on a small modal set and on intensifying rather than softening moves. Outside the student essay genre, Villanueva (2014) shows hedging used to manage accountability in Philippine newspaper editorials. Different genre, same point: hedging is context-sensitive rather than a fixed national style.</w:t>
       </w:r>
     </w:p>
     <w:p>
@@ -795,7 +767,7 @@
         <w:rPr>
           <w:rtl w:val="0"/>
         </w:rPr>
-        <w:t xml:space="preserve">Abstracts compress research into a constrained space. Expert abstract studies report measurable disciplinary differences in linguistic features such as voice and nominalization (Imataki &amp; Kobayashi, 2024), and large-scale work on promotion and caution finds hedge words more frequent in soft sciences and higher-ranking journals, with positive promotional wording more common in hard sciences (Xie &amp; Mi, 2023). Expert abstract conventions are relatively well mapped, but developing-researcher abstracts are not. Whether undergraduates in applied life sciences show any disciplinary differentiation in this genre remains an open empirical question.</w:t>
+        <w:t>Abstracts compress research into a constrained space. Imataki and Kobayashi (2024) report measurable disciplinary differences in expert abstracts for features such as voice and nominalization, which shows that field norms reach even the shortest research genres. Xie and Mi (2023) examine promotion and caution across disciplines and ranking levels. Hedge words were more frequent in soft sciences and higher-ranking journals, while positive promotional wording was more common in hard sciences. Their results make abstracts a useful site for studying how caution and promotion compete under length pressure. Expert abstract conventions are relatively well mapped. Developing-researcher abstracts are not. Whether undergraduates in applied life sciences show any disciplinary differentiation in this genre remains an open empirical question.</w:t>
       </w:r>
     </w:p>
     <w:p>
@@ -809,12 +781,12 @@
         <w:rPr>
           <w:rtl w:val="0"/>
         </w:rPr>
-        <w:t xml:space="preserve">Across the literature, expert writers show measurable disciplinary differentiation in hedging shaped by epistemic demands rather than a simple hard/soft divide (Salager-Meyer, 1994; Afshar et al., 2014; Wang, 2022; Xie &amp; Mi, 2023). Developing researchers across contexts show limited hedge variety and tend to default to modal verbs (Khunasathitchai et al., 2025; Wang, 2022; Ghia et al., 2022; Mazidah et al., 2022). L2 writers face additional constraints from linguistic factors, publication context, and limited explicit instruction (Demir, 2018; Hu &amp; Cao, 2011; Petchkij, 2019). Philippine and ASEAN studies confirm reliance on modals and, in some contexts, a preference for boosters (Ningrum et al., 2024; Escalona, 2025; Lopez et al., 2025). Abstract-focused work further shows that caution and promotion vary by discipline and ranking (Xie &amp; Mi, 2023), but undergraduate applied-science abstracts remain underdescribed.</w:t>
-      </w:r>
-    </w:p>
-    <w:p>
-      <w:r>
-        <w:t>Definitions of hedging in academic writing are not uniform. Hyland (1998) treats hedges as linguistic means that signal either reduced commitment to the truth of a proposition or a preference not to express that commitment categorically, and his polypragmatic model distinguishes content-oriented hedges (accuracy and reliability of the claim) from reader-oriented hedges (interpersonal effects on the audience). Salager-Meyer (1994) frames the same devices as tools for claim-responsibility management. Writers distribute responsibility for a statement’s accuracy among themselves, their data, and external conditions. Crompton (1997) argues that the term is most useful when reserved for epistemic modality attached to knowledge claims, and that extending hedge to every politeness-related feature of academic prose weakens the concept. Those positions leave open whether directives and recommendations, which manage action rather than the truth of a claim, should count as hedges. The present study takes a claim-centered stance. A hedge is coded only when a device changes the writer’s stance toward a proposition that evidence could show to be wrong. Epistemic Caution captures reduced commitment to that claim’s truth. Politeness/Deference captures interpersonal softening of the same claim. Softened recommendations are logged as false positives under this scope, not as evidence that politeness is absent from the writers’ repertoire.</w:t>
+        <w:t>Across the literature, expert writers show measurable disciplinary differentiation in hedging shaped by epistemic demands rather than a simple hard-or-soft divide (Salager-Meyer, 1994; Afshar et al., 2014; Wang, 2022; Xie &amp; Mi, 2023). Developing researchers across contexts show limited hedge variety and tend to default to modal verbs (Khunasathitchai et al., 2025; Wang, 2022; Ghia et al., 2022; Mazidah et al., 2022; Halabisaz et al., 2014). L2 writers face additional constraints from linguistic factors, publication context, and limited explicit instruction (Demir, 2018; Hu &amp; Cao, 2011; Petchkij, 2019). Philippine and ASEAN studies confirm reliance on modals and, in some contexts, a preference for boosters (Ningrum et al., 2024; Escalona, 2025; Lopez et al., 2025). Abstract-focused work further shows that caution and promotion vary by discipline and ranking (Xie &amp; Mi, 2023), but undergraduate applied-science abstracts remain underdescribed.</w:t>
+      </w:r>
+    </w:p>
+    <w:p>
+      <w:r>
+        <w:t>Definitions of hedging in academic writing are not uniform. Hyland (1998) treats hedges as linguistic means that signal either reduced commitment to the truth of a proposition or a preference not to express that commitment categorically. His polypragmatic model distinguishes content-oriented hedges, which manage accuracy and reliability of the claim, from reader-oriented hedges, which manage interpersonal effects on the audience. Salager-Meyer (1994) frames the same devices as tools for claim-responsibility management. Writers distribute responsibility for a statement’s accuracy among themselves, their data, and external conditions. Crompton (1997) argues that the term is most useful when reserved for epistemic modality attached to knowledge claims, and that extending hedge to every politeness-related feature of academic prose weakens the concept. Those positions leave open whether directives and recommendations, which manage action rather than the truth of a claim, should count as hedges. The present study takes a claim-centered stance. A hedge is coded only when a device changes the writer’s stance toward a proposition that evidence could show to be wrong. Epistemic caution captures reduced commitment to that claim’s truth. Politeness/deference captures interpersonal softening of the same claim. Softened recommendations are logged as false positives under this scope, not as evidence that politeness is absent from the writers’ repertoire.</w:t>
       </w:r>
     </w:p>
     <w:p>

</xml_diff>

<commit_message>
Add Halabisaz et al. (2014) APA ref + open PDF to thesis and references.md
</commit_message>
<xml_diff>
--- a/thesis/003_ThesisProposal_Draft_109_body.docx
+++ b/thesis/003_ThesisProposal_Draft_109_body.docx
@@ -9839,6 +9839,20 @@
         <w:rPr>
           <w:rtl w:val="0"/>
         </w:rPr>
+      </w:r>
+    </w:p>
+    <w:p>
+      <w:pPr>
+        <w:spacing w:line="480" w:lineRule="auto"/>
+        <w:ind w:left="720" w:hanging="720"/>
+        <w:jc w:val="left"/>
+      </w:pPr>
+      <w:r>
+        <w:rPr>
+          <w:rFonts w:ascii="Georgia" w:hAnsi="Georgia" w:eastAsia="Georgia"/>
+          <w:sz w:val="22"/>
+        </w:rPr>
+        <w:t>Halabisaz, B., Pazhakh, A., &amp; Shakibafar, M. (2014). Hedging in thesis abstracts on applied linguistics across Persian and English. International Review of Social Sciences and Humanities, 7(1), 211–218. https://www.irssh.com/yahoo_site_admin/assets/docs/20_IRSSH-841-V7N1.131231112.pdf</w:t>
       </w:r>
     </w:p>
     <w:p>

</xml_diff>

<commit_message>
Background: fully expound each study in Hedging in Undergraduate Writing only
</commit_message>
<xml_diff>
--- a/thesis/003_ThesisProposal_Draft_109_body.docx
+++ b/thesis/003_ThesisProposal_Draft_109_body.docx
@@ -563,9 +563,11 @@
       </w:pPr>
       <w:r>
         <w:rPr>
-          <w:rtl w:val="0"/>
-        </w:rPr>
-        <w:t>Studies of developing researchers converge on a restricted hedging repertoire. Khunasathitchai et al. (2025) examined hedging in Thai undergraduate writing and found low overall density with heavy reliance on a small set of modal forms. Suratno and Aydawati (2025) report a similar pattern in non-science thesis writing, where modal verbs carry most of the epistemic work and lexical variety stays narrow. Ghia et al. (2022) analyzed 217 English thesis abstracts written by advanced Italian EFL undergraduates and compared them with successful L1 student writing in the Michigan Corpus of Upper-Level Student Papers. The EFL abstracts used fewer hedges and favored boosters and modals of epistemic certainty more than the L1 comparison group, yet the broad ranking of devices still showed some awareness of academic caution. Mazidah et al. (2022) looked at Southeast Asian undergraduate abstracts and likewise found limited hedge inventories, with discipline-internal differences smaller than the shared tendency to under-hedge relative to expert norms. Across these settings the core pattern recurs: low hedge density, limited formal variety, and a default to modals such as may or to local equivalents, linked more to limited rhetorical exposure than to weak grammar alone.</w:t>
+          <w:rFonts w:ascii="Georgia" w:hAnsi="Georgia" w:eastAsia="Georgia"/>
+          <w:sz w:val="22"/>
+          <w:rtl w:val="0"/>
+        </w:rPr>
+        <w:t>Studies of developing researchers converge on a restricted hedging repertoire, but the evidence is not a single undifferentiated claim. Khunasathitchai et al. (2025) examined move structure and hedge use in undergraduate research proposals written in an EFL setting. Their analysis shows that hedges cluster in moves where writers project findings or justify the study, yet the inventory stays small and modal-heavy. Density remains low relative to expert scientific prose, which suggests that even when students know they should sound cautious, they recycle a few safe forms rather than deploy a field-sensitive range. Suratno and Aydawati (2025) shift the lens to discussion sections of non-science theses. Modal verbs again carry most of the epistemic work, while lexical hedges stay infrequent and repetitive. Because discussion sections offer more rhetorical space than abstracts, their finding is telling: limited variety is not only a product of length pressure. It also reflects a developing stance repertoire that has not yet branched into the fuller set of reporting verbs and approximators common in expert writing.</w:t>
       </w:r>
     </w:p>
     <w:p>
@@ -577,9 +579,53 @@
       </w:pPr>
       <w:r>
         <w:rPr>
-          <w:rtl w:val="0"/>
-        </w:rPr>
-        <w:t>Wang (2022) extends the student-writing picture across sixteen fields in MICUSP. Hedging was more common in argumentation-driven disciplines than in data-driven ones, and differences also appeared between disciplines housed under the same broad division. That finding challenges a simple natural-versus-social science split. Even so, modal forms remained prominent even in fields that hedged more overall. Halabisaz et al. (2014) compared hedging in applied-linguistics master’s thesis abstracts written by native English and Iranian non-native writers. Native writers used more hedges overall. The authors link the gap to rhetorical sensitivity, audience awareness, and cultural background rather than to grammar alone. Taken together, these studies show that undergraduate and master’s-level writers often under-deploy hedges, lean on modals, and vary by discipline only within a still-narrow range of forms. Clear gaps remain for the present work. Only a few of these studies examined abstracts specifically, and most of those focused on English or language majors rather than applied science programs. Others analyzed discussion sections or full papers, where rhetorical space is wider. None is set in a Philippine L2 context for Agriculture, Veterinary Medicine, and Biology undergraduate thesis abstracts.</w:t>
+          <w:rFonts w:ascii="Georgia" w:hAnsi="Georgia" w:eastAsia="Georgia"/>
+          <w:sz w:val="22"/>
+          <w:rtl w:val="0"/>
+        </w:rPr>
+        <w:t>Ghia et al. (2022) supply one of the clearest abstract-focused accounts. They built a corpus of 217 English-language bachelor’s thesis abstracts written by advanced Italian EFL undergraduates specializing in linguistic and cross-cultural mediation, totaling about 287,000 words, and compared hedge use with successful L1 student writing in MICUSP. Fifteen hedge types were set against boosters and modals of logical possibility and inferential certainty. The EFL abstracts used fewer hedges overall and leaned more on boosters and on modals of epistemic certainty than the L1 comparison group. At the same time, the ranking of devices was not random: students still preferred forms that mark caution, which the authors read as partial awareness of academic hedging rather than absence of the concept. The study matters for the present work because it isolates the thesis abstract as a genre and shows that advanced L2 writers can under-hedge even when their programs center on language. Mazidah et al. (2022) examined hedges and boosters in undergraduate thesis abstracts from a Southeast Asian institution and compared English and mathematics programs. Hedge inventories were limited in both groups. Discipline-internal differences appeared, but they were smaller than the shared gap relative to expert norms. Boosters competed with hedges in places where a more cautious claim might have been expected. Together, Ghia et al. and Mazidah et al. show that undergraduate abstracts are a productive site for studying stance, and that L2 and regional student writers often default to a narrow modal set under compression.</w:t>
+      </w:r>
+    </w:p>
+    <w:p>
+      <w:pPr>
+        <w:spacing w:line="480" w:lineRule="auto" w:before="0" w:after="0"/>
+        <w:ind w:firstLine="720"/>
+        <w:jc w:val="both"/>
+      </w:pPr>
+      <w:r>
+        <w:rPr>
+          <w:rFonts w:ascii="Georgia" w:hAnsi="Georgia" w:eastAsia="Georgia"/>
+          <w:sz w:val="22"/>
+        </w:rPr>
+        <w:t>Wang (2022) widens the student-writing picture by comparing hedging across sixteen disciplines in MICUSP. Five types of hedging devices were examined in successful upper-level student papers rather than in expert research articles alone. Hedging was more common in argumentation-driven fields than in data-driven ones, and further differences appeared between disciplines housed under the same broad division. That pattern challenges a simple natural-versus-social science split: two science fields need not hedge alike, and two humanities fields need not either. Even in fields that hedged more overall, modal forms remained prominent. Wang’s study therefore supports disciplinary comparison among student writers while also warning that “more hedging” does not automatically mean a richer formal repertoire. For applied life-science undergraduates, the implication is that any cross-program difference at PSAU should be read against this dual finding: discipline can matter, and modal dominance can persist even where density rises.</w:t>
+      </w:r>
+    </w:p>
+    <w:p>
+      <w:pPr>
+        <w:spacing w:line="480" w:lineRule="auto" w:before="0" w:after="0"/>
+        <w:ind w:firstLine="720"/>
+        <w:jc w:val="both"/>
+      </w:pPr>
+      <w:r>
+        <w:rPr>
+          <w:rFonts w:ascii="Georgia" w:hAnsi="Georgia" w:eastAsia="Georgia"/>
+          <w:sz w:val="22"/>
+        </w:rPr>
+        <w:t>Halabisaz et al. (2014) focus the comparison on thesis abstracts in applied linguistics. They sampled 300 master’s abstracts written between 2000 and 2013, split between native English writers and Iranian non-native writers, and coded hedges with Crompton’s (1997) taxonomy. Native English writers used more hedging devices overall. Non-native writers used fewer, a gap the authors attribute to rhetorical sensitivity, awareness of audience and purpose, and cultural background rather than to grammatical deficit alone. Because the unit of analysis is the thesis abstract, the study sits closer to the present design than full-paper comparisons do. It also shows that L1–L2 differences in hedging survive even among writers who have completed substantial graduate coursework in language-related fields.</w:t>
+      </w:r>
+    </w:p>
+    <w:p>
+      <w:pPr>
+        <w:spacing w:line="480" w:lineRule="auto" w:before="0" w:after="0"/>
+        <w:ind w:firstLine="720"/>
+        <w:jc w:val="both"/>
+      </w:pPr>
+      <w:r>
+        <w:rPr>
+          <w:rFonts w:ascii="Georgia" w:hAnsi="Georgia" w:eastAsia="Georgia"/>
+          <w:sz w:val="22"/>
+        </w:rPr>
+        <w:t>Taken together, these studies show that undergraduate and master’s-level writers often under-deploy hedges, lean on modals, and vary by discipline only within a still-narrow range of forms. Clear gaps remain for the present work. Only a few of these studies examined abstracts specifically, and most of those focused on English or language majors rather than applied science programs. Others analyzed discussion sections or full papers, where rhetorical space is wider. None is set in a Philippine L2 context for Agriculture, Veterinary Medicine, and Biology undergraduate thesis abstracts.</w:t>
       </w:r>
     </w:p>
     <w:p>

</xml_diff>

<commit_message>
Hedging in Undergraduate Writing: correct claims against source PDFs
</commit_message>
<xml_diff>
--- a/thesis/003_ThesisProposal_Draft_109_body.docx
+++ b/thesis/003_ThesisProposal_Draft_109_body.docx
@@ -567,7 +567,7 @@
           <w:sz w:val="22"/>
           <w:rtl w:val="0"/>
         </w:rPr>
-        <w:t>Studies of developing researchers converge on a restricted hedging repertoire, but the evidence is not a single undifferentiated claim. Khunasathitchai et al. (2025) examined move structure and hedge use in undergraduate research proposals written in an EFL setting. Their analysis shows that hedges cluster in moves where writers project findings or justify the study, yet the inventory stays small and modal-heavy. Density remains low relative to expert scientific prose, which suggests that even when students know they should sound cautious, they recycle a few safe forms rather than deploy a field-sensitive range. Suratno and Aydawati (2025) shift the lens to discussion sections of non-science theses. Modal verbs again carry most of the epistemic work, while lexical hedges stay infrequent and repetitive. Because discussion sections offer more rhetorical space than abstracts, their finding is telling: limited variety is not only a product of length pressure. It also reflects a developing stance repertoire that has not yet branched into the fuller set of reporting verbs and approximators common in expert writing.</w:t>
+        <w:t>Studies of developing researchers converge on a restricted hedging repertoire, but the evidence is not a single undifferentiated claim. Khunasathitchai et al. (2025) analyzed move structure and hedge use in 60 research paper abstracts written by Thai EFL English-majored undergraduates. Three moves were obligatory in their sample: presenting the research, describing the methodology, and summarizing the findings. Hedges appeared in the moves that present the research, summarize findings, and discuss the study, not evenly across the abstract. Modal verbs were the most frequent hedge type, followed by epistemic lexical verbs and epistemic adverbs, while epistemic adjectives were rare and epistemic nouns were absent. The inventory is therefore small and modal-heavy even in a language-major cohort writing the high-stakes abstract genre. Suratno and Aydawati (2025) shift the lens to discussion sections of non-science undergraduate theses. Using a corpus of 30 theses (over 100,000 words), they found that student writers relied heavily on the modal dapat compared with other hedging devices. That concentration suggests limited familiarity with a wider hedge set. Because discussion sections offer more rhetorical space than abstracts, the finding is telling: restricted variety is not only a product of length pressure. It also reflects a developing stance repertoire that has not yet branched into the fuller range of forms common in expert writing.</w:t>
       </w:r>
     </w:p>
     <w:p>
@@ -583,7 +583,7 @@
           <w:sz w:val="22"/>
           <w:rtl w:val="0"/>
         </w:rPr>
-        <w:t>Ghia et al. (2022) supply one of the clearest abstract-focused accounts. They built a corpus of 217 English-language bachelor’s thesis abstracts written by advanced Italian EFL undergraduates specializing in linguistic and cross-cultural mediation, totaling about 287,000 words, and compared hedge use with successful L1 student writing in MICUSP. Fifteen hedge types were set against boosters and modals of logical possibility and inferential certainty. The EFL abstracts used fewer hedges overall and leaned more on boosters and on modals of epistemic certainty than the L1 comparison group. At the same time, the ranking of devices was not random: students still preferred forms that mark caution, which the authors read as partial awareness of academic hedging rather than absence of the concept. The study matters for the present work because it isolates the thesis abstract as a genre and shows that advanced L2 writers can under-hedge even when their programs center on language. Mazidah et al. (2022) examined hedges and boosters in undergraduate thesis abstracts from a Southeast Asian institution and compared English and mathematics programs. Hedge inventories were limited in both groups. Discipline-internal differences appeared, but they were smaller than the shared gap relative to expert norms. Boosters competed with hedges in places where a more cautious claim might have been expected. Together, Ghia et al. and Mazidah et al. show that undergraduate abstracts are a productive site for studying stance, and that L2 and regional student writers often default to a narrow modal set under compression.</w:t>
+        <w:t>Ghia et al. (2022) supply one of the clearest abstract-focused accounts. They built a corpus of 217 English-language bachelor’s thesis abstracts written by advanced Italian EFL undergraduates specializing in linguistic and cross-cultural mediation, totaling 287,048 words, and compared hedge use with a subsection of successful L1 student writing in MICUSP. Fifteen hedge forms were set against boosters and modals of logical possibility and inferential certainty. The EFL abstracts used fewer hedges overall and leaned more on boosters and on modals of epistemic certainty than the L1 comparison group. At the same time, patterns in the two corpora still showed parallelisms, which the authors read as awareness of hedging strategies rather than absence of the concept. The study matters for the present work because it isolates the thesis abstract as a genre and shows that advanced L2 writers can under-hedge even when their programs center on language. Mazidah et al. (2022) compared hedges and boosters in 50 undergraduate thesis abstracts from Qomaruddin University: 25 from an English Language Education program and 25 from a Mathematics program. Coding followed Hyland’s (2005) taxonomy. Across the sample they recorded 53 hedge tokens (22 variants) against 130 booster tokens (17 variants), so boosters outnumbered hedges overall. Mathematics abstracts used more hedge tokens than the English-education abstracts, while the English-education group still showed a wider set of hedge word variants. The authors link student hedging to limited knowledge of English academic rhetoric. For the present study, the result underscores that undergraduate abstracts can favor certainty markers as much as caution, and that program differences need not follow a simple language-versus-science split.</w:t>
       </w:r>
     </w:p>
     <w:p>
@@ -597,7 +597,7 @@
           <w:rFonts w:ascii="Georgia" w:hAnsi="Georgia" w:eastAsia="Georgia"/>
           <w:sz w:val="22"/>
         </w:rPr>
-        <w:t>Wang (2022) widens the student-writing picture by comparing hedging across sixteen disciplines in MICUSP. Five types of hedging devices were examined in successful upper-level student papers rather than in expert research articles alone. Hedging was more common in argumentation-driven fields than in data-driven ones, and further differences appeared between disciplines housed under the same broad division. That pattern challenges a simple natural-versus-social science split: two science fields need not hedge alike, and two humanities fields need not either. Even in fields that hedged more overall, modal forms remained prominent. Wang’s study therefore supports disciplinary comparison among student writers while also warning that “more hedging” does not automatically mean a richer formal repertoire. For applied life-science undergraduates, the implication is that any cross-program difference at PSAU should be read against this dual finding: discipline can matter, and modal dominance can persist even where density rises.</w:t>
+        <w:t>Wang (2022) widens the student-writing picture by comparing hedging across sixteen disciplines in MICUSP. Five types of hedging devices were examined in successful upper-level student papers rather than in expert research articles alone. Hedging was more common in argumentation-driven disciplines than in data-driven ones, and further differences appeared between disciplines housed under the same broad division. That pattern challenges a simple natural-versus-social science split: two science fields need not hedge alike, and two fields within the same division need not either. Modal auxiliaries were one of the device types tracked, and disciplinary profiles for modal-auxiliary hedges differed across the corpus. Wang’s study therefore supports disciplinary comparison among student writers while also showing that aggregate “more hedging” can hide different formal mixes. For applied life-science undergraduates, the implication is that any cross-program difference at PSAU should be read against this dual finding: discipline can matter, and form-level patterns need to be reported alongside density.</w:t>
       </w:r>
     </w:p>
     <w:p>
@@ -611,7 +611,7 @@
           <w:rFonts w:ascii="Georgia" w:hAnsi="Georgia" w:eastAsia="Georgia"/>
           <w:sz w:val="22"/>
         </w:rPr>
-        <w:t>Halabisaz et al. (2014) focus the comparison on thesis abstracts in applied linguistics. They sampled 300 master’s abstracts written between 2000 and 2013, split between native English writers and Iranian non-native writers, and coded hedges with Crompton’s (1997) taxonomy. Native English writers used more hedging devices overall. Non-native writers used fewer, a gap the authors attribute to rhetorical sensitivity, awareness of audience and purpose, and cultural background rather than to grammatical deficit alone. Because the unit of analysis is the thesis abstract, the study sits closer to the present design than full-paper comparisons do. It also shows that L1–L2 differences in hedging survive even among writers who have completed substantial graduate coursework in language-related fields.</w:t>
+        <w:t>Halabisaz et al. (2014) focus the comparison on thesis abstracts in applied linguistics. They sampled 300 master’s abstracts written between 2000 and 2013, split between native English writers and Iranian non-native writers, and coded hedges according to Crompton’s (1997) taxonomy. Native English writers used more hedging devices overall. Non-native writers used fewer. The authors attribute the difference to rhetorical sensitivity, modality, awareness of audience and purpose, and cultural background. Because the unit of analysis is the thesis abstract, the study sits closer to the present design than full-paper comparisons do. It also shows that L1–L2 differences in hedging can appear even among writers who have completed substantial graduate coursework in a language-related field.</w:t>
       </w:r>
     </w:p>
     <w:p>
@@ -625,7 +625,7 @@
           <w:rFonts w:ascii="Georgia" w:hAnsi="Georgia" w:eastAsia="Georgia"/>
           <w:sz w:val="22"/>
         </w:rPr>
-        <w:t>Taken together, these studies show that undergraduate and master’s-level writers often under-deploy hedges, lean on modals, and vary by discipline only within a still-narrow range of forms. Clear gaps remain for the present work. Only a few of these studies examined abstracts specifically, and most of those focused on English or language majors rather than applied science programs. Others analyzed discussion sections or full papers, where rhetorical space is wider. None is set in a Philippine L2 context for Agriculture, Veterinary Medicine, and Biology undergraduate thesis abstracts.</w:t>
+        <w:t>Taken together, these studies show that undergraduate and master’s-level writers often under-deploy hedges, lean on a limited set of forms (often modals), and may differ by program without matching expert disciplinary profiles. Clear gaps remain for the present work. Only a few of these studies examined abstracts specifically, and most of those focused on English or language majors rather than applied science programs. Others analyzed discussion sections or full papers, where rhetorical space is wider. None is set in a Philippine L2 context for Agriculture, Veterinary Medicine, and Biology undergraduate thesis abstracts.</w:t>
       </w:r>
     </w:p>
     <w:p>

</xml_diff>

<commit_message>
Background subsection 2: expound disciplinary variation studies against PDFs
</commit_message>
<xml_diff>
--- a/thesis/003_ThesisProposal_Draft_109_body.docx
+++ b/thesis/003_ThesisProposal_Draft_109_body.docx
@@ -663,9 +663,11 @@
       </w:pPr>
       <w:r>
         <w:rPr>
-          <w:rtl w:val="0"/>
-        </w:rPr>
-        <w:t>Field norms shape expert hedging, but not along a simple hard-or-soft divide. Afshar et al. (2014) compared research articles across humanities, basic sciences, and agriculture using Salager-Meyer’s (1994) taxonomy. Humanities writers sat at the high end of hedge frequency, while agriculture sat near the low end, and subfields within each broad area also differed. Mohammed (2011), using a different pairing and a lexical-hedge focus, found scientists hedging more than applied linguists. The two results are not necessarily contradictory. They compare different disciplinary pairings and use different hedge inventories, so the shared lesson is that density tracks specific epistemic demands rather than a single hard-or-soft ranking. Within life sciences, Souici and Slougui (2022) examined biology research articles by Algerian authors and found non-factive reporting verbs to be the most prominent hedge type. Writers leaned on forms that support and frame findings rather than on a wide modal set alone. Hamidi et al. (2025) report that clinical writing may edge slightly above basic science within medicine, yet without a strong separation. Expert scientific English therefore shows measurable variation, but the variation is local to how each field handles evidence and claim risk.</w:t>
+          <w:rFonts w:ascii="Georgia" w:hAnsi="Georgia" w:eastAsia="Georgia"/>
+          <w:sz w:val="22"/>
+          <w:rtl w:val="0"/>
+        </w:rPr>
+        <w:t>Field norms shape expert hedging, but not along a simple hard-or-soft divide. Afshar et al. (2014) compared the Discussion sections of 180 research articles across three fields: Humanities (Law, Persian literature, TEFL), Basic Sciences (Biology, Applied Chemistry, Geology), and Agriculture (Biotechnology, Soil Sciences, Horticulture), with 20 articles per sub-field. Coding followed Salager-Meyer’s (1994) taxonomy. Chi-square tests showed significant differences both among the three fields and among sub-fields within each field. Humanities articles carried the highest overall hedge counts in their sample. Agriculture and Basic Sciences sat lower, with further unevenness inside each field (for example across TEFL, Law, and Persian literature, or across biotechnology, soil science, and horticulture). The study therefore does more than rank “soft” above “hard.” It shows that sub-field matters even when articles share a broad disciplinary label.</w:t>
       </w:r>
     </w:p>
     <w:p>
@@ -677,9 +679,67 @@
       </w:pPr>
       <w:r>
         <w:rPr>
-          <w:rtl w:val="0"/>
-        </w:rPr>
-        <w:t>Salager-Meyer (1994) frames hedging as claim-responsibility management. Writers distribute responsibility for a claim’s truth, accuracy, or applicability among themselves, their data, and external conditions. That lens helps explain why laboratory and clinical fields may not share one density profile with field-based agricultural work even when all three count as applied life science. Hu and Cao (2011) add a further layer by comparing English- and Chinese-medium journal abstracts. English-medium abstracts carried higher hedge rates, and coding required attention to context rather than to word lists alone. Their work also shows that empirical abstracts can carry more boosters than theoretical ones while hedge rates stay similar, which links stance choices to evidence type. For developing writers in L2 settings, the expert picture is a target rather than a description of current practice. The present study asks whether PSAU undergraduates in three applied programs already show any of that field-sensitive differentiation in the compressed genre of the thesis abstract.</w:t>
+          <w:rFonts w:ascii="Georgia" w:hAnsi="Georgia" w:eastAsia="Georgia"/>
+          <w:sz w:val="22"/>
+          <w:rtl w:val="0"/>
+        </w:rPr>
+        <w:t>Mohammed (2011) takes a different cut. The study compared lexical hedges in research articles from biochemistry and applied linguistics, written by American and Arabic authors. American writers used more hedging forms than Arabic writers in both disciplines. Across cultural groups, linguists used considerably fewer hedges than scientists, and biochemistry articles were more heavily hedged than applied-linguistics articles. Discussion sections contained more hedges than introductions. Because Mohammed focuses on lexical hedges rather than Salager-Meyer’s full taxonomy, the ranking cannot be stacked directly onto Afshar et al.’s field totals. What the two studies share is the finding that density tracks the pairing under analysis and the coding scheme, not a single universal hard-or-soft scale.</w:t>
+      </w:r>
+    </w:p>
+    <w:p>
+      <w:pPr>
+        <w:spacing w:line="480" w:lineRule="auto"/>
+        <w:ind w:firstLine="720"/>
+        <w:jc w:val="both"/>
+      </w:pPr>
+      <w:r>
+        <w:rPr>
+          <w:rFonts w:ascii="Georgia" w:hAnsi="Georgia" w:eastAsia="Georgia"/>
+          <w:sz w:val="22"/>
+        </w:rPr>
+        <w:t>Within life sciences, Souici and Slougui (2022) examined hedges in 31 biology research articles by Algerian authors, drawn from five locally published journals. They coded type, frequency, and distribution across research-article sections. Main verbs were the most prominent hedge category overall. Within that category, non-factive reporting verbs ranked highest. Algerian biologists in the sample relied heavily on those verbs as strategic devices to support and frame their own findings in relation to other work. The formal profile is therefore not modal-led. It is reporting-verb-led, which matters when undergraduate corpora are later compared with expert biology writing that may favor different forms under the same broad label “hedge.”</w:t>
+      </w:r>
+    </w:p>
+    <w:p>
+      <w:pPr>
+        <w:spacing w:line="480" w:lineRule="auto"/>
+        <w:ind w:firstLine="720"/>
+        <w:jc w:val="both"/>
+      </w:pPr>
+      <w:r>
+        <w:rPr>
+          <w:rFonts w:ascii="Georgia" w:hAnsi="Georgia" w:eastAsia="Georgia"/>
+          <w:sz w:val="22"/>
+        </w:rPr>
+        <w:t>Hamidi et al. (2025) compared hedging devices in the conclusion sections of basic-science and clinical-science papers published in 2024 in the Medical Journal of the Islamic Republic of Iran (150 papers in the working set). Clinical papers used more hedge tokens overall (330 versus 154 in basic science), and the clinical set led in each of the four taxonomy categories they applied. An inferential test, however, found no statistically significant difference between basic-science and clinical-science papers. The authors conclude that hedging in this medical journal is shaped by journal standards and cultural factors as well as by the basic-versus-clinical split. For the present study, the result is a caution: a numerical edge for one life-science strand need not survive significance testing, and institutional venue can matter as much as field.</w:t>
+      </w:r>
+    </w:p>
+    <w:p>
+      <w:pPr>
+        <w:spacing w:line="480" w:lineRule="auto"/>
+        <w:ind w:firstLine="720"/>
+        <w:jc w:val="both"/>
+      </w:pPr>
+      <w:r>
+        <w:rPr>
+          <w:rFonts w:ascii="Georgia" w:hAnsi="Georgia" w:eastAsia="Georgia"/>
+          <w:sz w:val="22"/>
+        </w:rPr>
+        <w:t>Salager-Meyer (1994) anchors much of this comparative work in medical English. Analyzing research papers and case reports from leading medical journals, she showed that hedge frequency and category distribution shift with rhetorical section. Discussion and Comment sections were the most heavily hedged. Methods and case-report body sections were among the least. Shields, approximators, and compound hedges accounted for the great majority of devices. Introductions favored shields (especially epistemic verbs) as writers carved an early niche for the study. That section-sensitive account supports reading hedging as claim management under genre pressure rather than as a fixed field quota. Hu and Cao (2011) add medium and evidence type. In applied-linguistics journal abstracts, English-medium texts featured markedly more hedges than Chinese-medium texts. Abstracts of empirical research articles used significantly more boosters than non-empirical academic articles, while hedge patterns also required contextual reading rather than word-list matching alone. Stance choices therefore track publication language and evidence type as well as discipline.</w:t>
+      </w:r>
+    </w:p>
+    <w:p>
+      <w:pPr>
+        <w:spacing w:line="480" w:lineRule="auto"/>
+        <w:ind w:firstLine="720"/>
+        <w:jc w:val="both"/>
+      </w:pPr>
+      <w:r>
+        <w:rPr>
+          <w:rFonts w:ascii="Georgia" w:hAnsi="Georgia" w:eastAsia="Georgia"/>
+          <w:sz w:val="22"/>
+        </w:rPr>
+        <w:t>Expert scientific English therefore shows measurable variation, but the variation is local to how each field, section, and publication context handles evidence and claim risk. For developing writers in L2 settings, that expert picture is a target rather than a description of current practice. The present study asks whether PSAU undergraduates in three applied programs already show any of that field-sensitive differentiation in the compressed genre of the thesis abstract.</w:t>
       </w:r>
     </w:p>
     <w:p>

</xml_diff>

<commit_message>
Subsection 2: expand disciplinary variation with Hyland 1996, Rezvani, Bonyadi, Smirnova
</commit_message>
<xml_diff>
--- a/thesis/003_ThesisProposal_Draft_109_body.docx
+++ b/thesis/003_ThesisProposal_Draft_109_body.docx
@@ -656,39 +656,35 @@
     </w:p>
     <w:p>
       <w:pPr>
-        <w:spacing w:after="0" w:before="0" w:line="480" w:lineRule="auto"/>
+        <w:spacing w:line="480" w:lineRule="auto" w:before="0" w:after="0"/>
         <w:ind w:firstLine="720"/>
         <w:jc w:val="both"/>
-        <w:rPr/>
       </w:pPr>
       <w:r>
         <w:rPr>
           <w:rFonts w:ascii="Georgia" w:hAnsi="Georgia" w:eastAsia="Georgia"/>
           <w:sz w:val="22"/>
-          <w:rtl w:val="0"/>
-        </w:rPr>
-        <w:t>Field norms shape expert hedging, but not along a simple hard-or-soft divide. Afshar et al. (2014) compared the Discussion sections of 180 research articles across three fields: Humanities (Law, Persian literature, TEFL), Basic Sciences (Biology, Applied Chemistry, Geology), and Agriculture (Biotechnology, Soil Sciences, Horticulture), with 20 articles per sub-field. Coding followed Salager-Meyer’s (1994) taxonomy. Chi-square tests showed significant differences both among the three fields and among sub-fields within each field. Humanities articles carried the highest overall hedge counts in their sample. Agriculture and Basic Sciences sat lower, with further unevenness inside each field (for example across TEFL, Law, and Persian literature, or across biotechnology, soil science, and horticulture). The study therefore does more than rank “soft” above “hard.” It shows that sub-field matters even when articles share a broad disciplinary label.</w:t>
-      </w:r>
-    </w:p>
-    <w:p>
-      <w:pPr>
-        <w:spacing w:after="0" w:before="0" w:line="480" w:lineRule="auto"/>
+        </w:rPr>
+        <w:t>Expert scientific English therefore shows measurable variation, but the variation is local to how each field, section, medium, and publication context handles evidence and claim risk. For developing writers in L2 settings, that expert picture is a target rather than a description of current practice. The present study asks whether PSAU undergraduates in three applied programs already show any of that field-sensitive differentiation in the compressed genre of the thesis abstract.</w:t>
+      </w:r>
+    </w:p>
+    <w:p>
+      <w:pPr>
+        <w:spacing w:line="480" w:lineRule="auto" w:before="0" w:after="0"/>
         <w:ind w:firstLine="720"/>
         <w:jc w:val="both"/>
-        <w:rPr/>
       </w:pPr>
       <w:r>
         <w:rPr>
           <w:rFonts w:ascii="Georgia" w:hAnsi="Georgia" w:eastAsia="Georgia"/>
           <w:sz w:val="22"/>
-          <w:rtl w:val="0"/>
-        </w:rPr>
-        <w:t>Mohammed (2011) takes a different cut. The study compared lexical hedges in research articles from biochemistry and applied linguistics, written by American and Arabic authors. American writers used more hedging forms than Arabic writers in both disciplines. Across cultural groups, linguists used considerably fewer hedges than scientists, and biochemistry articles were more heavily hedged than applied-linguistics articles. Discussion sections contained more hedges than introductions. Because Mohammed focuses on lexical hedges rather than Salager-Meyer’s full taxonomy, the ranking cannot be stacked directly onto Afshar et al.’s field totals. What the two studies share is the finding that density tracks the pairing under analysis and the coding scheme, not a single universal hard-or-soft scale.</w:t>
-      </w:r>
-    </w:p>
-    <w:p>
-      <w:pPr>
-        <w:spacing w:line="480" w:lineRule="auto"/>
+        </w:rPr>
+        <w:t>Smirnova and Pérez-Guerra (2025) ask whether formal stance features alone can recover hard-versus-soft disciplinary groups. Their corpus covers about 1.6 million words of research articles from eight disciplines: chemistry, physics, engineering, and mathematics on the hard side, and business studies, history, linguistics, and political science on the soft side. Grammatical and lexical stance features, including hedges, boosters, and self-mention, were quantified and modelled. Multivariate analysis identified features that significantly contributed to hard-versus-soft variation. Clustering on those formal frequencies alone grouped the eight disciplines into two clusters matching the original hard and soft division. The result strengthens the claim that disciplinary variation in stance is systematic enough to classify fields, even when meaning-based interpretation is set aside.</w:t>
+      </w:r>
+    </w:p>
+    <w:p>
+      <w:pPr>
+        <w:spacing w:line="480" w:lineRule="auto" w:before="0" w:after="0"/>
         <w:ind w:firstLine="720"/>
         <w:jc w:val="both"/>
       </w:pPr>
@@ -697,12 +693,12 @@
           <w:rFonts w:ascii="Georgia" w:hAnsi="Georgia" w:eastAsia="Georgia"/>
           <w:sz w:val="22"/>
         </w:rPr>
-        <w:t>Within life sciences, Souici and Slougui (2022) examined hedges in 31 biology research articles by Algerian authors, drawn from five locally published journals. They coded type, frequency, and distribution across research-article sections. Main verbs were the most prominent hedge category overall. Within that category, non-factive reporting verbs ranked highest. Algerian biologists in the sample relied heavily on those verbs as strategic devices to support and frame their own findings in relation to other work. The formal profile is therefore not modal-led. It is reporting-verb-led, which matters when undergraduate corpora are later compared with expert biology writing that may favor different forms under the same broad label “hedge.”</w:t>
-      </w:r>
-    </w:p>
-    <w:p>
-      <w:pPr>
-        <w:spacing w:line="480" w:lineRule="auto"/>
+        <w:t>Salager-Meyer (1994) anchors much of this comparative work in medical English. In research papers and case reports from leading medical journals, hedge frequency and category distribution shifted with rhetorical section. Discussion and Comment sections were the most heavily hedged. Methods and case-report body sections were among the least. Shields, approximators, and compound hedges accounted for the great majority of devices. Introductions favored shields, especially epistemic verbs, as writers carved an early niche for the study. Hu and Cao (2011) add publication medium and evidence type. In applied-linguistics journal abstracts, English-medium texts featured markedly more hedges than Chinese-medium texts, and empirical research abstracts used significantly more boosters than non-empirical articles. Stance choices therefore track section, medium, and evidence type as well as discipline.</w:t>
+      </w:r>
+    </w:p>
+    <w:p>
+      <w:pPr>
+        <w:spacing w:line="480" w:lineRule="auto" w:before="0" w:after="0"/>
         <w:ind w:firstLine="720"/>
         <w:jc w:val="both"/>
       </w:pPr>
@@ -711,12 +707,12 @@
           <w:rFonts w:ascii="Georgia" w:hAnsi="Georgia" w:eastAsia="Georgia"/>
           <w:sz w:val="22"/>
         </w:rPr>
-        <w:t>Hamidi et al. (2025) compared hedging devices in the conclusion sections of basic-science and clinical-science papers published in 2024 in the Medical Journal of the Islamic Republic of Iran (150 papers in the working set). Clinical papers used more hedge tokens overall (330 versus 154 in basic science), and the clinical set led in each of the four taxonomy categories they applied. An inferential test, however, found no statistically significant difference between basic-science and clinical-science papers. The authors conclude that hedging in this medical journal is shaped by journal standards and cultural factors as well as by the basic-versus-clinical split. For the present study, the result is a caution: a numerical edge for one life-science strand need not survive significance testing, and institutional venue can matter as much as field.</w:t>
-      </w:r>
-    </w:p>
-    <w:p>
-      <w:pPr>
-        <w:spacing w:line="480" w:lineRule="auto"/>
+        <w:t>Within life sciences proper, Souici and Slougui (2022) examined 31 biology research articles by Algerian authors from five locally published journals. Main verbs were the most prominent hedge category. Within that category, non-factive reporting verbs ranked highest. Writers relied on those verbs to support and frame findings rather than on a wide modal set alone. Hamidi et al. (2025) compared conclusion sections of basic-science and clinical-science papers in the Medical Journal of the Islamic Republic of Iran. Clinical papers used more hedge tokens (330 versus 154), yet an inferential test found no statistically significant difference. Journal standards and cultural factors, the authors argue, shape hedging as much as the basic-versus-clinical split.</w:t>
+      </w:r>
+    </w:p>
+    <w:p>
+      <w:pPr>
+        <w:spacing w:line="480" w:lineRule="auto" w:before="0" w:after="0"/>
         <w:ind w:firstLine="720"/>
         <w:jc w:val="both"/>
       </w:pPr>
@@ -725,12 +721,12 @@
           <w:rFonts w:ascii="Georgia" w:hAnsi="Georgia" w:eastAsia="Georgia"/>
           <w:sz w:val="22"/>
         </w:rPr>
-        <w:t>Salager-Meyer (1994) anchors much of this comparative work in medical English. Analyzing research papers and case reports from leading medical journals, she showed that hedge frequency and category distribution shift with rhetorical section. Discussion and Comment sections were the most heavily hedged. Methods and case-report body sections were among the least. Shields, approximators, and compound hedges accounted for the great majority of devices. Introductions favored shields (especially epistemic verbs) as writers carved an early niche for the study. That section-sensitive account supports reading hedging as claim management under genre pressure rather than as a fixed field quota. Hu and Cao (2011) add medium and evidence type. In applied-linguistics journal abstracts, English-medium texts featured markedly more hedges than Chinese-medium texts. Abstracts of empirical research articles used significantly more boosters than non-empirical academic articles, while hedge patterns also required contextual reading rather than word-list matching alone. Stance choices therefore track publication language and evidence type as well as discipline.</w:t>
-      </w:r>
-    </w:p>
-    <w:p>
-      <w:pPr>
-        <w:spacing w:line="480" w:lineRule="auto"/>
+        <w:t>Bonyadi, Gholami, and Nasiri (2012) keep the lens on an applied science close to agriculture. They compared hedges in Discussion sections of 60 environmental-sciences research articles: 20 by English research writers, 20 by Iranian writers in English, and 20 by Iranian writers in Farsi, coded with Salager-Meyer’s (1994) taxonomy. English and Iranian English articles did not differ significantly in hedge use. English and Farsi articles did. The authors link the English–Farsi gap to rhetorical preference in Farsi for less hedged, more categorically validated prose, a pattern that sits at odds with international environmental-science discourse expectations. For the present corpus, the study is a reminder that applied-science hedging norms are international as well as disciplinary, and that L1 background can still shape English research writing in the same field.</w:t>
+      </w:r>
+    </w:p>
+    <w:p>
+      <w:pPr>
+        <w:spacing w:line="480" w:lineRule="auto" w:before="0" w:after="0"/>
         <w:ind w:firstLine="720"/>
         <w:jc w:val="both"/>
       </w:pPr>
@@ -739,7 +735,49 @@
           <w:rFonts w:ascii="Georgia" w:hAnsi="Georgia" w:eastAsia="Georgia"/>
           <w:sz w:val="22"/>
         </w:rPr>
-        <w:t>Expert scientific English therefore shows measurable variation, but the variation is local to how each field, section, and publication context handles evidence and claim risk. For developing writers in L2 settings, that expert picture is a target rather than a description of current practice. The present study asks whether PSAU undergraduates in three applied programs already show any of that field-sensitive differentiation in the compressed genre of the thesis abstract.</w:t>
+        <w:t>Rezvani and Javadi (2021) test hard-versus-soft differences in abstracts by Iranian writers of English. They sampled 200 research-article abstracts, 50 each from chemistry, mathematics, philosophy, and English, grouped as hard and soft sciences under Biglan’s (1973) typology. Soft-science abstracts used more hedge expressions overall. Soft writers drew more on modals, verbs, nouns, adjectives, and adverbs, while hard-science writers used more conditional expressions. Epistemic and cognition verbs were the most frequent hedging expressions in both groups. The study supports disciplinary differentiation inside the compressed abstract genre and shows that form mix, not only density, separates the two clusters.</w:t>
+      </w:r>
+    </w:p>
+    <w:p>
+      <w:pPr>
+        <w:spacing w:line="480" w:lineRule="auto" w:before="0" w:after="0"/>
+        <w:ind w:firstLine="720"/>
+        <w:jc w:val="both"/>
+      </w:pPr>
+      <w:r>
+        <w:rPr>
+          <w:rFonts w:ascii="Georgia" w:hAnsi="Georgia" w:eastAsia="Georgia"/>
+          <w:sz w:val="22"/>
+        </w:rPr>
+        <w:t>Mohammed (2011) takes a different cut. Comparing lexical hedges in biochemistry and applied-linguistics research articles by American and Arabic authors, the study found that American writers used more hedging forms than Arabic writers in both disciplines. Linguists used considerably fewer hedges than scientists, and biochemistry articles were more heavily hedged than applied-linguistics articles. Discussion sections contained more hedges than introductions. Because Mohammed focuses on lexical hedges rather than Salager-Meyer’s full taxonomy, the ranking cannot be stacked directly onto Afshar et al.’s field totals. What the two studies share is that density tracks the pairing under analysis and the coding scheme, not a single universal hard-or-soft scale.</w:t>
+      </w:r>
+    </w:p>
+    <w:p>
+      <w:pPr>
+        <w:spacing w:line="480" w:lineRule="auto" w:before="0" w:after="0"/>
+        <w:ind w:firstLine="720"/>
+        <w:jc w:val="both"/>
+      </w:pPr>
+      <w:r>
+        <w:rPr>
+          <w:rFonts w:ascii="Georgia" w:hAnsi="Georgia" w:eastAsia="Georgia"/>
+          <w:sz w:val="22"/>
+        </w:rPr>
+        <w:t>Afshar et al. (2014) scale the comparison across fields. They examined Discussion sections of 180 research articles from Humanities (Law, Persian literature, TEFL), Basic Sciences (Biology, Applied Chemistry, Geology), and Agriculture (Biotechnology, Soil Sciences, Horticulture), with 20 articles per sub-field, using Salager-Meyer’s (1994) taxonomy. Significant differences appeared both among the three fields and among sub-fields within each field. Humanities articles carried the highest overall hedge counts. Agriculture and Basic Sciences sat lower, with further unevenness inside each label. The study therefore does more than rank soft above hard. It shows that sub-field matters even when articles share a broad disciplinary name.</w:t>
+      </w:r>
+    </w:p>
+    <w:p>
+      <w:pPr>
+        <w:spacing w:line="480" w:lineRule="auto" w:before="0" w:after="0"/>
+        <w:ind w:firstLine="720"/>
+        <w:jc w:val="both"/>
+      </w:pPr>
+      <w:r>
+        <w:rPr>
+          <w:rFonts w:ascii="Georgia" w:hAnsi="Georgia" w:eastAsia="Georgia"/>
+          <w:sz w:val="22"/>
+        </w:rPr>
+        <w:t>Field norms shape expert hedging, but not along a simple hard-or-soft divide. Hyland (1996) grounds that claim in scientific research writing itself. In a corpus of 26 molecular biology research articles, he shows that hedging is central to gaining reader acceptance of claims. Writers use hedges to state findings with precision, caution, and deference to colleagues rather than as optional politeness. Lexical forms carry most of the load. About 79% of hedging instances are lexical, mainly verbs, adjectives, and adverbs, rather than modal verbs alone. That formal profile matters for later comparison with undergraduate biology and applied-life-science abstracts that may lean more heavily on a small modal set.</w:t>
       </w:r>
     </w:p>
     <w:p>

</xml_diff>

<commit_message>
Subsection 2: fix paragraph order after expansion
</commit_message>
<xml_diff>
--- a/thesis/003_ThesisProposal_Draft_109_body.docx
+++ b/thesis/003_ThesisProposal_Draft_109_body.docx
@@ -665,7 +665,7 @@
           <w:rFonts w:ascii="Georgia" w:hAnsi="Georgia" w:eastAsia="Georgia"/>
           <w:sz w:val="22"/>
         </w:rPr>
-        <w:t>Expert scientific English therefore shows measurable variation, but the variation is local to how each field, section, medium, and publication context handles evidence and claim risk. For developing writers in L2 settings, that expert picture is a target rather than a description of current practice. The present study asks whether PSAU undergraduates in three applied programs already show any of that field-sensitive differentiation in the compressed genre of the thesis abstract.</w:t>
+        <w:t>Field norms shape expert hedging, but not along a simple hard-or-soft divide. Hyland (1996) grounds that claim in scientific research writing itself. In a corpus of 26 molecular biology research articles, he shows that hedging is central to gaining reader acceptance of claims. Writers use hedges to state findings with precision, caution, and deference to colleagues rather than as optional politeness. Lexical forms carry most of the load. About 79% of hedging instances are lexical, mainly verbs, adjectives, and adverbs, rather than modal verbs alone. That formal profile matters for later comparison with undergraduate biology and applied-life-science abstracts that may lean more heavily on a small modal set.</w:t>
       </w:r>
     </w:p>
     <w:p>
@@ -679,7 +679,7 @@
           <w:rFonts w:ascii="Georgia" w:hAnsi="Georgia" w:eastAsia="Georgia"/>
           <w:sz w:val="22"/>
         </w:rPr>
-        <w:t>Smirnova and Pérez-Guerra (2025) ask whether formal stance features alone can recover hard-versus-soft disciplinary groups. Their corpus covers about 1.6 million words of research articles from eight disciplines: chemistry, physics, engineering, and mathematics on the hard side, and business studies, history, linguistics, and political science on the soft side. Grammatical and lexical stance features, including hedges, boosters, and self-mention, were quantified and modelled. Multivariate analysis identified features that significantly contributed to hard-versus-soft variation. Clustering on those formal frequencies alone grouped the eight disciplines into two clusters matching the original hard and soft division. The result strengthens the claim that disciplinary variation in stance is systematic enough to classify fields, even when meaning-based interpretation is set aside.</w:t>
+        <w:t>Afshar et al. (2014) scale the comparison across fields. They examined Discussion sections of 180 research articles from Humanities (Law, Persian literature, TEFL), Basic Sciences (Biology, Applied Chemistry, Geology), and Agriculture (Biotechnology, Soil Sciences, Horticulture), with 20 articles per sub-field, using Salager-Meyer’s (1994) taxonomy. Significant differences appeared both among the three fields and among sub-fields within each field. Humanities articles carried the highest overall hedge counts. Agriculture and Basic Sciences sat lower, with further unevenness inside each label. The study therefore does more than rank soft above hard. It shows that sub-field matters even when articles share a broad disciplinary name.</w:t>
       </w:r>
     </w:p>
     <w:p>
@@ -693,7 +693,7 @@
           <w:rFonts w:ascii="Georgia" w:hAnsi="Georgia" w:eastAsia="Georgia"/>
           <w:sz w:val="22"/>
         </w:rPr>
-        <w:t>Salager-Meyer (1994) anchors much of this comparative work in medical English. In research papers and case reports from leading medical journals, hedge frequency and category distribution shifted with rhetorical section. Discussion and Comment sections were the most heavily hedged. Methods and case-report body sections were among the least. Shields, approximators, and compound hedges accounted for the great majority of devices. Introductions favored shields, especially epistemic verbs, as writers carved an early niche for the study. Hu and Cao (2011) add publication medium and evidence type. In applied-linguistics journal abstracts, English-medium texts featured markedly more hedges than Chinese-medium texts, and empirical research abstracts used significantly more boosters than non-empirical articles. Stance choices therefore track section, medium, and evidence type as well as discipline.</w:t>
+        <w:t>Mohammed (2011) takes a different cut. Comparing lexical hedges in biochemistry and applied-linguistics research articles by American and Arabic authors, the study found that American writers used more hedging forms than Arabic writers in both disciplines. Linguists used considerably fewer hedges than scientists, and biochemistry articles were more heavily hedged than applied-linguistics articles. Discussion sections contained more hedges than introductions. Because Mohammed focuses on lexical hedges rather than Salager-Meyer’s full taxonomy, the ranking cannot be stacked directly onto Afshar et al.’s field totals. What the two studies share is that density tracks the pairing under analysis and the coding scheme, not a single universal hard-or-soft scale.</w:t>
       </w:r>
     </w:p>
     <w:p>
@@ -707,7 +707,7 @@
           <w:rFonts w:ascii="Georgia" w:hAnsi="Georgia" w:eastAsia="Georgia"/>
           <w:sz w:val="22"/>
         </w:rPr>
-        <w:t>Within life sciences proper, Souici and Slougui (2022) examined 31 biology research articles by Algerian authors from five locally published journals. Main verbs were the most prominent hedge category. Within that category, non-factive reporting verbs ranked highest. Writers relied on those verbs to support and frame findings rather than on a wide modal set alone. Hamidi et al. (2025) compared conclusion sections of basic-science and clinical-science papers in the Medical Journal of the Islamic Republic of Iran. Clinical papers used more hedge tokens (330 versus 154), yet an inferential test found no statistically significant difference. Journal standards and cultural factors, the authors argue, shape hedging as much as the basic-versus-clinical split.</w:t>
+        <w:t>Rezvani and Javadi (2021) test hard-versus-soft differences in abstracts by Iranian writers of English. They sampled 200 research-article abstracts, 50 each from chemistry, mathematics, philosophy, and English, grouped as hard and soft sciences under Biglan’s (1973) typology. Soft-science abstracts used more hedge expressions overall. Soft writers drew more on modals, verbs, nouns, adjectives, and adverbs, while hard-science writers used more conditional expressions. Epistemic and cognition verbs were the most frequent hedging expressions in both groups. The study supports disciplinary differentiation inside the compressed abstract genre and shows that form mix, not only density, separates the two clusters.</w:t>
       </w:r>
     </w:p>
     <w:p>
@@ -735,7 +735,7 @@
           <w:rFonts w:ascii="Georgia" w:hAnsi="Georgia" w:eastAsia="Georgia"/>
           <w:sz w:val="22"/>
         </w:rPr>
-        <w:t>Rezvani and Javadi (2021) test hard-versus-soft differences in abstracts by Iranian writers of English. They sampled 200 research-article abstracts, 50 each from chemistry, mathematics, philosophy, and English, grouped as hard and soft sciences under Biglan’s (1973) typology. Soft-science abstracts used more hedge expressions overall. Soft writers drew more on modals, verbs, nouns, adjectives, and adverbs, while hard-science writers used more conditional expressions. Epistemic and cognition verbs were the most frequent hedging expressions in both groups. The study supports disciplinary differentiation inside the compressed abstract genre and shows that form mix, not only density, separates the two clusters.</w:t>
+        <w:t>Within life sciences proper, Souici and Slougui (2022) examined 31 biology research articles by Algerian authors from five locally published journals. Main verbs were the most prominent hedge category. Within that category, non-factive reporting verbs ranked highest. Writers relied on those verbs to support and frame findings rather than on a wide modal set alone. Hamidi et al. (2025) compared conclusion sections of basic-science and clinical-science papers in the Medical Journal of the Islamic Republic of Iran. Clinical papers used more hedge tokens (330 versus 154), yet an inferential test found no statistically significant difference. Journal standards and cultural factors, the authors argue, shape hedging as much as the basic-versus-clinical split.</w:t>
       </w:r>
     </w:p>
     <w:p>
@@ -749,7 +749,7 @@
           <w:rFonts w:ascii="Georgia" w:hAnsi="Georgia" w:eastAsia="Georgia"/>
           <w:sz w:val="22"/>
         </w:rPr>
-        <w:t>Mohammed (2011) takes a different cut. Comparing lexical hedges in biochemistry and applied-linguistics research articles by American and Arabic authors, the study found that American writers used more hedging forms than Arabic writers in both disciplines. Linguists used considerably fewer hedges than scientists, and biochemistry articles were more heavily hedged than applied-linguistics articles. Discussion sections contained more hedges than introductions. Because Mohammed focuses on lexical hedges rather than Salager-Meyer’s full taxonomy, the ranking cannot be stacked directly onto Afshar et al.’s field totals. What the two studies share is that density tracks the pairing under analysis and the coding scheme, not a single universal hard-or-soft scale.</w:t>
+        <w:t>Salager-Meyer (1994) anchors much of this comparative work in medical English. In research papers and case reports from leading medical journals, hedge frequency and category distribution shifted with rhetorical section. Discussion and Comment sections were the most heavily hedged. Methods and case-report body sections were among the least. Shields, approximators, and compound hedges accounted for the great majority of devices. Introductions favored shields, especially epistemic verbs, as writers carved an early niche for the study. Hu and Cao (2011) add publication medium and evidence type. In applied-linguistics journal abstracts, English-medium texts featured markedly more hedges than Chinese-medium texts, and empirical research abstracts used significantly more boosters than non-empirical articles. Stance choices therefore track section, medium, and evidence type as well as discipline.</w:t>
       </w:r>
     </w:p>
     <w:p>
@@ -763,7 +763,7 @@
           <w:rFonts w:ascii="Georgia" w:hAnsi="Georgia" w:eastAsia="Georgia"/>
           <w:sz w:val="22"/>
         </w:rPr>
-        <w:t>Afshar et al. (2014) scale the comparison across fields. They examined Discussion sections of 180 research articles from Humanities (Law, Persian literature, TEFL), Basic Sciences (Biology, Applied Chemistry, Geology), and Agriculture (Biotechnology, Soil Sciences, Horticulture), with 20 articles per sub-field, using Salager-Meyer’s (1994) taxonomy. Significant differences appeared both among the three fields and among sub-fields within each field. Humanities articles carried the highest overall hedge counts. Agriculture and Basic Sciences sat lower, with further unevenness inside each label. The study therefore does more than rank soft above hard. It shows that sub-field matters even when articles share a broad disciplinary name.</w:t>
+        <w:t>Smirnova and Pérez-Guerra (2025) ask whether formal stance features alone can recover hard-versus-soft disciplinary groups. Their corpus covers about 1.6 million words of research articles from eight disciplines: chemistry, physics, engineering, and mathematics on the hard side, and business studies, history, linguistics, and political science on the soft side. Grammatical and lexical stance features, including hedges, boosters, and self-mention, were quantified and modelled. Multivariate analysis identified features that significantly contributed to hard-versus-soft variation. Clustering on those formal frequencies alone grouped the eight disciplines into two clusters matching the original hard and soft division. The result strengthens the claim that disciplinary variation in stance is systematic enough to classify fields, even when meaning-based interpretation is set aside.</w:t>
       </w:r>
     </w:p>
     <w:p>
@@ -777,7 +777,7 @@
           <w:rFonts w:ascii="Georgia" w:hAnsi="Georgia" w:eastAsia="Georgia"/>
           <w:sz w:val="22"/>
         </w:rPr>
-        <w:t>Field norms shape expert hedging, but not along a simple hard-or-soft divide. Hyland (1996) grounds that claim in scientific research writing itself. In a corpus of 26 molecular biology research articles, he shows that hedging is central to gaining reader acceptance of claims. Writers use hedges to state findings with precision, caution, and deference to colleagues rather than as optional politeness. Lexical forms carry most of the load. About 79% of hedging instances are lexical, mainly verbs, adjectives, and adverbs, rather than modal verbs alone. That formal profile matters for later comparison with undergraduate biology and applied-life-science abstracts that may lean more heavily on a small modal set.</w:t>
+        <w:t>Expert scientific English therefore shows measurable variation, but the variation is local to how each field, section, medium, and publication context handles evidence and claim risk. For developing writers in L2 settings, that expert picture is a target rather than a description of current practice. The present study asks whether PSAU undergraduates in three applied programs already show any of that field-sensitive differentiation in the compressed genre of the thesis abstract.</w:t>
       </w:r>
     </w:p>
     <w:p>

</xml_diff>

<commit_message>
Subsection 3: expand Hedging in L2 and EFL Contexts against source PDFs
</commit_message>
<xml_diff>
--- a/thesis/003_ThesisProposal_Draft_109_body.docx
+++ b/thesis/003_ThesisProposal_Draft_109_body.docx
@@ -588,6 +588,19 @@
     </w:p>
     <w:p>
       <w:pPr>
+        <w:spacing w:line="480" w:lineRule="auto"/>
+        <w:ind w:left="720" w:hanging="720"/>
+      </w:pPr>
+      <w:r>
+        <w:rPr>
+          <w:rFonts w:ascii="Georgia" w:hAnsi="Georgia"/>
+          <w:sz w:val="22"/>
+        </w:rPr>
+        <w:t>Takimoto, M. (2015). Assertions and lexical invisibility in EFL learners’ academic essays. Journal of Pragmatics, 89, 85–99. https://doi.org/10.1016/j.pragma.2015.10.003</w:t>
+      </w:r>
+    </w:p>
+    <w:p>
+      <w:pPr>
         <w:spacing w:line="480" w:lineRule="auto" w:before="0" w:after="0"/>
         <w:ind w:firstLine="720"/>
         <w:jc w:val="both"/>
@@ -808,30 +821,86 @@
     </w:p>
     <w:p>
       <w:pPr>
-        <w:spacing w:after="0" w:before="0" w:line="480" w:lineRule="auto"/>
-        <w:ind w:firstLine="720"/>
-        <w:jc w:val="both"/>
-        <w:rPr/>
-      </w:pPr>
-      <w:r>
-        <w:rPr>
-          <w:rtl w:val="0"/>
-        </w:rPr>
-        <w:t>English is the medium of academic writing at PSAU, but not the home language for most students. Demir (2018) and related L2 work show that second-language writers typically use fewer hedges and less formal variety than L1 peers. Publication context can amplify that gap. Hu and Cao (2011) found English-medium journal abstracts markedly more hedged than Chinese-medium counterparts in the same field, which suggests that the language of publication and the editorial community shape stance as much as individual proficiency. Petchkij (2019) reports that explicit teaching can raise both frequency and variety among health-science undergraduates, though a preference for modals often remains even after training. The instructional finding matters for PSAU: limited hedge variety in student texts is not only a deficit to be counted. It is also a trainable feature of English for academic purposes.</w:t>
-      </w:r>
-    </w:p>
-    <w:p>
-      <w:pPr>
-        <w:spacing w:after="0" w:before="0" w:line="480" w:lineRule="auto"/>
-        <w:ind w:firstLine="720"/>
-        <w:jc w:val="both"/>
-        <w:rPr/>
-      </w:pPr>
-      <w:r>
-        <w:rPr>
-          <w:rtl w:val="0"/>
-        </w:rPr>
-        <w:t>Since this study does not measure English proficiency independently, observed patterns may reflect L2 constraints, disciplinary socialization, or both. The aim is a descriptive baseline of how stance is worded in ratified abstracts, not a test of which factor causes the pattern.</w:t>
+        <w:spacing w:line="480" w:lineRule="auto" w:before="0" w:after="0"/>
+        <w:ind w:firstLine="720"/>
+        <w:jc w:val="both"/>
+      </w:pPr>
+      <w:r>
+        <w:rPr>
+          <w:rFonts w:ascii="Georgia" w:hAnsi="Georgia" w:eastAsia="Georgia"/>
+          <w:sz w:val="22"/>
+        </w:rPr>
+        <w:t>Since the present study does not measure English proficiency independently, observed patterns in the PSAU corpus may reflect L2 constraints, disciplinary socialization, instructional history, or some combination of these. The aim is a descriptive baseline of how stance is worded in ratified undergraduate thesis abstracts, not a test of which single factor causes the pattern.</w:t>
+      </w:r>
+    </w:p>
+    <w:p>
+      <w:pPr>
+        <w:spacing w:line="480" w:lineRule="auto" w:before="0" w:after="0"/>
+        <w:ind w:firstLine="720"/>
+        <w:jc w:val="both"/>
+      </w:pPr>
+      <w:r>
+        <w:rPr>
+          <w:rFonts w:ascii="Georgia" w:hAnsi="Georgia" w:eastAsia="Georgia"/>
+          <w:sz w:val="22"/>
+        </w:rPr>
+        <w:t>Instruction and regional student populations push the same themes into classroom-facing research. Petchkij (2019) argues that explicit teaching of hedges can raise their use in Thai EFL contexts, though modal forms often remain dominant. Ningrum, Puspita, and Mulyadi (2024) examine hedges and boosters in the academic writing of ASEAN EFL learners and document limited inventories under regional L2 conditions. Lopez et al. (2025) and Escalona (2025) extend the Philippine and college-essay evidence on caution, certainty, and proficiency-related patterns in student writing. Bayraktar-Çepni and Kulaksız (2022) compare hedging in discussion sections of ELT MA and PhD theses and find that MA theses contained significantly more hedges than PhD theses, a difference they link to developing writers’ stronger need to soften stance. Level of academic experience, not only L1 versus L2 status, therefore shapes how much caution writers encode.</w:t>
+      </w:r>
+    </w:p>
+    <w:p>
+      <w:pPr>
+        <w:spacing w:line="480" w:lineRule="auto" w:before="0" w:after="0"/>
+        <w:ind w:firstLine="720"/>
+        <w:jc w:val="both"/>
+      </w:pPr>
+      <w:r>
+        <w:rPr>
+          <w:rFonts w:ascii="Georgia" w:hAnsi="Georgia" w:eastAsia="Georgia"/>
+          <w:sz w:val="22"/>
+        </w:rPr>
+        <w:t>Publication medium and cultural writing tradition can widen the same gap. Hu and Cao (2011) found that applied-linguistics abstracts in English-medium journals carried markedly more hedges than those in Chinese-medium journals, a difference they link jointly to rhetorical convention and epistemological belief. Halabisaz et al. (2014), already noted for thesis abstracts, attributed native–non-native differences in applied-linguistics master’s abstracts to rhetorical sensitivity and cultural background as well as to form. Ghia et al. (2022) showed that advanced Italian EFL undergraduates writing English thesis abstracts still used fewer hedges and more boosters and certainty modals than L1 student writing in MICUSP, even while displaying partial awareness of academic caution.</w:t>
+      </w:r>
+    </w:p>
+    <w:p>
+      <w:pPr>
+        <w:spacing w:line="480" w:lineRule="auto" w:before="0" w:after="0"/>
+        <w:ind w:firstLine="720"/>
+        <w:jc w:val="both"/>
+      </w:pPr>
+      <w:r>
+        <w:rPr>
+          <w:rFonts w:ascii="Georgia" w:hAnsi="Georgia" w:eastAsia="Georgia"/>
+          <w:sz w:val="22"/>
+        </w:rPr>
+        <w:t>Takimoto (2015) adds a recognition layer. In a corpus comparison of academic essays by Japanese EFL learners and native speakers of English, the EFL group used more boosters than hedges and preferred straightforward, explicit expressions, whereas native writers were more tentative. A follow-up task suggested that certainty items were more visible to the learners than possibility and probability items, which they often misapprehended. Underuse of hedges can therefore coexist with limited pragmatic awareness of what the missing forms do. Luo’s (2021) systematic review of undergraduate English language learners’ hedging reaches a similar aggregate conclusion: ELLs generally use fewer hedges than native speakers, draw on a narrower inventory, and face combined challenges of academic experience and L2 form control.</w:t>
+      </w:r>
+    </w:p>
+    <w:p>
+      <w:pPr>
+        <w:spacing w:line="480" w:lineRule="auto" w:before="0" w:after="0"/>
+        <w:ind w:firstLine="720"/>
+        <w:jc w:val="both"/>
+      </w:pPr>
+      <w:r>
+        <w:rPr>
+          <w:rFonts w:ascii="Georgia" w:hAnsi="Georgia" w:eastAsia="Georgia"/>
+          <w:sz w:val="22"/>
+        </w:rPr>
+        <w:t>Hinkel (2005) sharpens the formal picture with a large student-essay corpus (745 essays, about 221,000 words). Non-native writers used a severely limited range of hedging devices, many of them associated with conversational rather than formal written discourse. The same essays showed a prevalence of conversational intensifiers and overstatements that are common in informal speech but rare in academic prose. Demir (2018) compared lexical hedges in academic texts by native and non-native writers of English and reported significant differences across modal, verbal, adjectival, adverbial, quantifier, and noun hedges, as well as in total hedge use. Taken together, these studies show that the L2 issue is not only density. It is range, register, and the balance between caution and overstatement.</w:t>
+      </w:r>
+    </w:p>
+    <w:p>
+      <w:pPr>
+        <w:spacing w:line="480" w:lineRule="auto" w:before="0" w:after="0"/>
+        <w:ind w:firstLine="720"/>
+        <w:jc w:val="both"/>
+      </w:pPr>
+      <w:r>
+        <w:rPr>
+          <w:rFonts w:ascii="Georgia" w:hAnsi="Georgia" w:eastAsia="Georgia"/>
+          <w:sz w:val="22"/>
+        </w:rPr>
+        <w:t>English is the medium of academic writing at PSAU, but not the home language for most students. Research on second-language academic writing has long treated hedging as a point of difficulty rather than as a simple vocabulary gap. Hyland and Milton (1997) compared expressions of doubt and certainty in a one-million-word corpus of examination scripts from 900 Cantonese-speaking school leavers writing in English and 770 British learners of similar age and educational level. The L2 writers relied on a more limited range of epistemic items, offered stronger commitments, and had greater difficulty conveying a precise degree of certainty than their L1 peers. That pattern set the baseline still cited across EFL research: L2 academic writers often under-qualify claims or overuse a small set of strong forms.</w:t>
       </w:r>
     </w:p>
     <w:p>
@@ -9843,6 +9912,19 @@
     </w:p>
     <w:p>
       <w:pPr>
+        <w:spacing w:line="480" w:lineRule="auto"/>
+        <w:ind w:left="720" w:hanging="720"/>
+      </w:pPr>
+      <w:r>
+        <w:rPr>
+          <w:rFonts w:ascii="Georgia" w:hAnsi="Georgia"/>
+          <w:sz w:val="22"/>
+        </w:rPr>
+        <w:t>Bayraktar-Çepni, S., &amp; Kulaksız, E. (2022). A comparative study on the use of hedging devices across ELT MA and PhD theses. Futuristic Implementations of Research in Education (FIRE), 3(1), 58–66.</w:t>
+      </w:r>
+    </w:p>
+    <w:p>
+      <w:pPr>
         <w:spacing w:after="0" w:before="0" w:line="480" w:lineRule="auto"/>
         <w:ind w:left="720" w:hanging="720"/>
         <w:jc w:val="both"/>
@@ -10284,6 +10366,19 @@
         <w:rPr>
           <w:rtl w:val="0"/>
         </w:rPr>
+      </w:r>
+    </w:p>
+    <w:p>
+      <w:pPr>
+        <w:spacing w:line="480" w:lineRule="auto"/>
+        <w:ind w:left="720" w:hanging="720"/>
+      </w:pPr>
+      <w:r>
+        <w:rPr>
+          <w:rFonts w:ascii="Georgia" w:hAnsi="Georgia"/>
+          <w:sz w:val="22"/>
+        </w:rPr>
+        <w:t>Luo, S. (2021). A systematic review of undergraduate English language learners’ use of hedging in English academic writing [Capstone paper, Vanderbilt University].</w:t>
       </w:r>
     </w:p>
     <w:p>

</xml_diff>

<commit_message>
Subsection 3: fix paragraph order
</commit_message>
<xml_diff>
--- a/thesis/003_ThesisProposal_Draft_109_body.docx
+++ b/thesis/003_ThesisProposal_Draft_109_body.docx
@@ -830,7 +830,7 @@
           <w:rFonts w:ascii="Georgia" w:hAnsi="Georgia" w:eastAsia="Georgia"/>
           <w:sz w:val="22"/>
         </w:rPr>
-        <w:t>Since the present study does not measure English proficiency independently, observed patterns in the PSAU corpus may reflect L2 constraints, disciplinary socialization, instructional history, or some combination of these. The aim is a descriptive baseline of how stance is worded in ratified undergraduate thesis abstracts, not a test of which single factor causes the pattern.</w:t>
+        <w:t>English is the medium of academic writing at PSAU, but not the home language for most students. Research on second-language academic writing has long treated hedging as a point of difficulty rather than as a simple vocabulary gap. Hyland and Milton (1997) compared expressions of doubt and certainty in a one-million-word corpus of examination scripts from 900 Cantonese-speaking school leavers writing in English and 770 British learners of similar age and educational level. The L2 writers relied on a more limited range of epistemic items, offered stronger commitments, and had greater difficulty conveying a precise degree of certainty than their L1 peers. That pattern set the baseline still cited across EFL research: L2 academic writers often under-qualify claims or overuse a small set of strong forms.</w:t>
       </w:r>
     </w:p>
     <w:p>
@@ -844,7 +844,7 @@
           <w:rFonts w:ascii="Georgia" w:hAnsi="Georgia" w:eastAsia="Georgia"/>
           <w:sz w:val="22"/>
         </w:rPr>
-        <w:t>Instruction and regional student populations push the same themes into classroom-facing research. Petchkij (2019) argues that explicit teaching of hedges can raise their use in Thai EFL contexts, though modal forms often remain dominant. Ningrum, Puspita, and Mulyadi (2024) examine hedges and boosters in the academic writing of ASEAN EFL learners and document limited inventories under regional L2 conditions. Lopez et al. (2025) and Escalona (2025) extend the Philippine and college-essay evidence on caution, certainty, and proficiency-related patterns in student writing. Bayraktar-Çepni and Kulaksız (2022) compare hedging in discussion sections of ELT MA and PhD theses and find that MA theses contained significantly more hedges than PhD theses, a difference they link to developing writers’ stronger need to soften stance. Level of academic experience, not only L1 versus L2 status, therefore shapes how much caution writers encode.</w:t>
+        <w:t>Hinkel (2005) sharpens the formal picture with a large student-essay corpus (745 essays, about 221,000 words). Non-native writers used a severely limited range of hedging devices, many of them associated with conversational rather than formal written discourse. The same essays showed a prevalence of conversational intensifiers and overstatements that are common in informal speech but rare in academic prose. Demir (2018) compared lexical hedges in academic texts by native and non-native writers of English and reported significant differences across modal, verbal, adjectival, adverbial, quantifier, and noun hedges, as well as in total hedge use. Taken together, these studies show that the L2 issue is not only density. It is range, register, and the balance between caution and overstatement.</w:t>
       </w:r>
     </w:p>
     <w:p>
@@ -858,7 +858,7 @@
           <w:rFonts w:ascii="Georgia" w:hAnsi="Georgia" w:eastAsia="Georgia"/>
           <w:sz w:val="22"/>
         </w:rPr>
-        <w:t>Publication medium and cultural writing tradition can widen the same gap. Hu and Cao (2011) found that applied-linguistics abstracts in English-medium journals carried markedly more hedges than those in Chinese-medium journals, a difference they link jointly to rhetorical convention and epistemological belief. Halabisaz et al. (2014), already noted for thesis abstracts, attributed native–non-native differences in applied-linguistics master’s abstracts to rhetorical sensitivity and cultural background as well as to form. Ghia et al. (2022) showed that advanced Italian EFL undergraduates writing English thesis abstracts still used fewer hedges and more boosters and certainty modals than L1 student writing in MICUSP, even while displaying partial awareness of academic caution.</w:t>
+        <w:t>Takimoto (2015) adds a recognition layer. In a corpus comparison of academic essays by Japanese EFL learners and native speakers of English, the EFL group used more boosters than hedges and preferred straightforward, explicit expressions, whereas native writers were more tentative. A follow-up task suggested that certainty items were more visible to the learners than possibility and probability items, which they often misapprehended. Underuse of hedges can therefore coexist with limited pragmatic awareness of what the missing forms do. Luo’s (2021) systematic review of undergraduate English language learners’ hedging reaches a similar aggregate conclusion: ELLs generally use fewer hedges than native speakers, draw on a narrower inventory, and face combined challenges of academic experience and L2 form control.</w:t>
       </w:r>
     </w:p>
     <w:p>
@@ -872,7 +872,7 @@
           <w:rFonts w:ascii="Georgia" w:hAnsi="Georgia" w:eastAsia="Georgia"/>
           <w:sz w:val="22"/>
         </w:rPr>
-        <w:t>Takimoto (2015) adds a recognition layer. In a corpus comparison of academic essays by Japanese EFL learners and native speakers of English, the EFL group used more boosters than hedges and preferred straightforward, explicit expressions, whereas native writers were more tentative. A follow-up task suggested that certainty items were more visible to the learners than possibility and probability items, which they often misapprehended. Underuse of hedges can therefore coexist with limited pragmatic awareness of what the missing forms do. Luo’s (2021) systematic review of undergraduate English language learners’ hedging reaches a similar aggregate conclusion: ELLs generally use fewer hedges than native speakers, draw on a narrower inventory, and face combined challenges of academic experience and L2 form control.</w:t>
+        <w:t>Publication medium and cultural writing tradition can widen the same gap. Hu and Cao (2011) found that applied-linguistics abstracts in English-medium journals carried markedly more hedges than those in Chinese-medium journals, a difference they link jointly to rhetorical convention and epistemological belief. Halabisaz et al. (2014), already noted for thesis abstracts, attributed native–non-native differences in applied-linguistics master’s abstracts to rhetorical sensitivity and cultural background as well as to form. Ghia et al. (2022) showed that advanced Italian EFL undergraduates writing English thesis abstracts still used fewer hedges and more boosters and certainty modals than L1 student writing in MICUSP, even while displaying partial awareness of academic caution.</w:t>
       </w:r>
     </w:p>
     <w:p>
@@ -886,7 +886,7 @@
           <w:rFonts w:ascii="Georgia" w:hAnsi="Georgia" w:eastAsia="Georgia"/>
           <w:sz w:val="22"/>
         </w:rPr>
-        <w:t>Hinkel (2005) sharpens the formal picture with a large student-essay corpus (745 essays, about 221,000 words). Non-native writers used a severely limited range of hedging devices, many of them associated with conversational rather than formal written discourse. The same essays showed a prevalence of conversational intensifiers and overstatements that are common in informal speech but rare in academic prose. Demir (2018) compared lexical hedges in academic texts by native and non-native writers of English and reported significant differences across modal, verbal, adjectival, adverbial, quantifier, and noun hedges, as well as in total hedge use. Taken together, these studies show that the L2 issue is not only density. It is range, register, and the balance between caution and overstatement.</w:t>
+        <w:t>Instruction and regional student populations push the same themes into classroom-facing research. Petchkij (2019) argues that explicit teaching of hedges can raise their use in Thai EFL contexts, though modal forms often remain dominant. Ningrum, Puspita, and Mulyadi (2024) examine hedges and boosters in the academic writing of ASEAN EFL learners and document limited inventories under regional L2 conditions. Lopez et al. (2025) and Escalona (2025) extend the Philippine and college-essay evidence on caution, certainty, and proficiency-related patterns in student writing. Bayraktar-Çepni and Kulaksız (2022) compare hedging in discussion sections of ELT MA and PhD theses and find that MA theses contained significantly more hedges than PhD theses, a difference they link to developing writers’ stronger need to soften stance. Level of academic experience, not only L1 versus L2 status, therefore shapes how much caution writers encode.</w:t>
       </w:r>
     </w:p>
     <w:p>
@@ -900,7 +900,7 @@
           <w:rFonts w:ascii="Georgia" w:hAnsi="Georgia" w:eastAsia="Georgia"/>
           <w:sz w:val="22"/>
         </w:rPr>
-        <w:t>English is the medium of academic writing at PSAU, but not the home language for most students. Research on second-language academic writing has long treated hedging as a point of difficulty rather than as a simple vocabulary gap. Hyland and Milton (1997) compared expressions of doubt and certainty in a one-million-word corpus of examination scripts from 900 Cantonese-speaking school leavers writing in English and 770 British learners of similar age and educational level. The L2 writers relied on a more limited range of epistemic items, offered stronger commitments, and had greater difficulty conveying a precise degree of certainty than their L1 peers. That pattern set the baseline still cited across EFL research: L2 academic writers often under-qualify claims or overuse a small set of strong forms.</w:t>
+        <w:t>Since the present study does not measure English proficiency independently, observed patterns in the PSAU corpus may reflect L2 constraints, disciplinary socialization, instructional history, or some combination of these. The aim is a descriptive baseline of how stance is worded in ratified undergraduate thesis abstracts, not a test of which single factor causes the pattern.</w:t>
       </w:r>
     </w:p>
     <w:p>

</xml_diff>

<commit_message>
Subsection 3: fix in-text citations to APA 7 (et al., narrative form)
</commit_message>
<xml_diff>
--- a/thesis/003_ThesisProposal_Draft_109_body.docx
+++ b/thesis/003_ThesisProposal_Draft_109_body.docx
@@ -858,7 +858,7 @@
           <w:rFonts w:ascii="Georgia" w:hAnsi="Georgia" w:eastAsia="Georgia"/>
           <w:sz w:val="22"/>
         </w:rPr>
-        <w:t>Takimoto (2015) adds a recognition layer. In a corpus comparison of academic essays by Japanese EFL learners and native speakers of English, the EFL group used more boosters than hedges and preferred straightforward, explicit expressions, whereas native writers were more tentative. A follow-up task suggested that certainty items were more visible to the learners than possibility and probability items, which they often misapprehended. Underuse of hedges can therefore coexist with limited pragmatic awareness of what the missing forms do. Luo’s (2021) systematic review of undergraduate English language learners’ hedging reaches a similar aggregate conclusion: ELLs generally use fewer hedges than native speakers, draw on a narrower inventory, and face combined challenges of academic experience and L2 form control.</w:t>
+        <w:t>Takimoto (2015) adds a recognition layer. In a corpus comparison of academic essays by Japanese EFL learners and native speakers of English, the EFL group used more boosters than hedges and preferred straightforward, explicit expressions, whereas native writers were more tentative. A follow-up task suggested that certainty items were more visible to the learners than possibility and probability items, which they often misapprehended. Underuse of hedges can therefore coexist with limited pragmatic awareness of what the missing forms do. Luo (2021) reaches a similar aggregate conclusion in a systematic review of undergraduate English language learners’ hedging: ELLs generally use fewer hedges than native speakers, draw on a narrower inventory, and face combined challenges of academic experience and L2 form control.</w:t>
       </w:r>
     </w:p>
     <w:p>
@@ -886,7 +886,7 @@
           <w:rFonts w:ascii="Georgia" w:hAnsi="Georgia" w:eastAsia="Georgia"/>
           <w:sz w:val="22"/>
         </w:rPr>
-        <w:t>Instruction and regional student populations push the same themes into classroom-facing research. Petchkij (2019) argues that explicit teaching of hedges can raise their use in Thai EFL contexts, though modal forms often remain dominant. Ningrum, Puspita, and Mulyadi (2024) examine hedges and boosters in the academic writing of ASEAN EFL learners and document limited inventories under regional L2 conditions. Lopez et al. (2025) and Escalona (2025) extend the Philippine and college-essay evidence on caution, certainty, and proficiency-related patterns in student writing. Bayraktar-Çepni and Kulaksız (2022) compare hedging in discussion sections of ELT MA and PhD theses and find that MA theses contained significantly more hedges than PhD theses, a difference they link to developing writers’ stronger need to soften stance. Level of academic experience, not only L1 versus L2 status, therefore shapes how much caution writers encode.</w:t>
+        <w:t>Instruction and regional student populations push the same themes into classroom-facing research. Petchkij (2019) argues that explicit teaching of hedges can raise their use in Thai EFL contexts, though modal forms often remain dominant. Ningrum et al. (2024) examine hedges and boosters in the academic writing of ASEAN EFL learners and document limited inventories under regional L2 conditions. Lopez et al. (2025) and Escalona (2025) extend the Philippine and college-essay evidence on caution, certainty, and proficiency-related patterns in student writing. Bayraktar-Çepni and Kulaksız (2022) compare hedging in discussion sections of ELT MA and PhD theses and find that MA theses contained significantly more hedges than PhD theses, a difference they link to developing writers’ stronger need to soften stance. Level of academic experience, not only L1 versus L2 status, therefore shapes how much caution writers encode.</w:t>
       </w:r>
     </w:p>
     <w:p>
@@ -10136,6 +10136,19 @@
         <w:rPr>
           <w:rtl w:val="0"/>
         </w:rPr>
+      </w:r>
+    </w:p>
+    <w:p>
+      <w:pPr>
+        <w:spacing w:line="480" w:lineRule="auto"/>
+        <w:ind w:left="720" w:hanging="720"/>
+      </w:pPr>
+      <w:r>
+        <w:rPr>
+          <w:rFonts w:ascii="Georgia" w:hAnsi="Georgia"/>
+          <w:sz w:val="22"/>
+        </w:rPr>
+        <w:t>Hinkel, E. (2005). Hedging, inflating, and persuading in L2 academic writing. Applied Language Learning, 15(1–2), 29–53.</w:t>
       </w:r>
     </w:p>
     <w:p>

</xml_diff>

<commit_message>
Draft_109_body: remove Takimoto full reference from body text
Full APA reference line is not an in-text citation. Narrative
Takimoto (2015) remains. Reference-list DOI is 10.1016/j.pragma.2015.09.009
(not .10.003).
</commit_message>
<xml_diff>
--- a/thesis/003_ThesisProposal_Draft_109_body.docx
+++ b/thesis/003_ThesisProposal_Draft_109_body.docx
@@ -591,13 +591,6 @@
         <w:spacing w:line="480" w:lineRule="auto"/>
         <w:ind w:left="720" w:hanging="720"/>
       </w:pPr>
-      <w:r>
-        <w:rPr>
-          <w:rFonts w:ascii="Georgia" w:hAnsi="Georgia"/>
-          <w:sz w:val="22"/>
-        </w:rPr>
-        <w:t>Takimoto, M. (2015). Assertions and lexical invisibility in EFL learners’ academic essays. Journal of Pragmatics, 89, 85–99. https://doi.org/10.1016/j.pragma.2015.10.003</w:t>
-      </w:r>
     </w:p>
     <w:p>
       <w:pPr>

</xml_diff>